<commit_message>
Melakukan perbaikan pada template praktikum & Perbaikan pada file akhir Praktikum M2.pdf
</commit_message>
<xml_diff>
--- a/Praktikum/Template Laporan Praktikum Jarkom IF25-21008.docx
+++ b/Praktikum/Template Laporan Praktikum Jarkom IF25-21008.docx
@@ -20,6 +20,7 @@
           <w:spacing w:val="0"/>
           <w:sz w:val="20"/>
           <w:szCs w:val="36"/>
+          <w:lang w:val="sv-SE"/>
         </w:rPr>
         <w:t>Pertemuan</w:t>
       </w:r>
@@ -97,14 +98,14 @@
                         </a:ln>
                         <a:extLst>
                           <a:ext uri="{909E8E84-426E-40dd-AFC4-6F175D3DCCD1}">
-                            <a14:hiddenFill xmlns:a14="http://schemas.microsoft.com/office/drawing/2010/main" xmlns:w="http://schemas.openxmlformats.org/wordprocessingml/2006/main" xmlns:w10="urn:schemas-microsoft-com:office:word" xmlns:v="urn:schemas-microsoft-com:vml" xmlns:o="urn:schemas-microsoft-com:office:office" xmlns="" xmlns:mv="urn:schemas-microsoft-com:mac:vml" xmlns:mo="http://schemas.microsoft.com/office/mac/office/2008/main">
+                            <a14:hiddenFill xmlns:mo="http://schemas.microsoft.com/office/mac/office/2008/main" xmlns:mv="urn:schemas-microsoft-com:mac:vml" xmlns="" xmlns:o="urn:schemas-microsoft-com:office:office" xmlns:v="urn:schemas-microsoft-com:vml" xmlns:w10="urn:schemas-microsoft-com:office:word" xmlns:w="http://schemas.openxmlformats.org/wordprocessingml/2006/main" xmlns:a14="http://schemas.microsoft.com/office/drawing/2010/main">
                               <a:solidFill>
                                 <a:srgbClr val="FFFFFF"/>
                               </a:solidFill>
                             </a14:hiddenFill>
                           </a:ext>
                           <a:ext uri="{91240B29-F687-4f45-9708-019B960494DF}">
-                            <a14:hiddenLine xmlns:a14="http://schemas.microsoft.com/office/drawing/2010/main" xmlns:w="http://schemas.openxmlformats.org/wordprocessingml/2006/main" xmlns:w10="urn:schemas-microsoft-com:office:word" xmlns:v="urn:schemas-microsoft-com:vml" xmlns:o="urn:schemas-microsoft-com:office:office" xmlns="" xmlns:mv="urn:schemas-microsoft-com:mac:vml" xmlns:mo="http://schemas.microsoft.com/office/mac/office/2008/main" w="9525">
+                            <a14:hiddenLine xmlns:mo="http://schemas.microsoft.com/office/mac/office/2008/main" xmlns:mv="urn:schemas-microsoft-com:mac:vml" xmlns="" xmlns:o="urn:schemas-microsoft-com:office:office" xmlns:v="urn:schemas-microsoft-com:vml" xmlns:w10="urn:schemas-microsoft-com:office:word" xmlns:w="http://schemas.openxmlformats.org/wordprocessingml/2006/main" xmlns:a14="http://schemas.microsoft.com/office/drawing/2010/main" w="9525">
                               <a:solidFill>
                                 <a:srgbClr val="000000"/>
                               </a:solidFill>
@@ -125,7 +126,6 @@
                                 <w:szCs w:val="28"/>
                               </w:rPr>
                             </w:pPr>
-                            <w:proofErr w:type="spellStart"/>
                             <w:r>
                               <w:rPr>
                                 <w:rFonts w:asciiTheme="minorHAnsi" w:hAnsiTheme="minorHAnsi"/>
@@ -134,25 +134,14 @@
                               </w:rPr>
                               <w:t>Laporan</w:t>
                             </w:r>
-                            <w:proofErr w:type="spellEnd"/>
                             <w:r>
                               <w:rPr>
                                 <w:rFonts w:asciiTheme="minorHAnsi" w:hAnsiTheme="minorHAnsi"/>
                                 <w:sz w:val="28"/>
                                 <w:szCs w:val="28"/>
                               </w:rPr>
-                              <w:t xml:space="preserve"> </w:t>
+                              <w:t xml:space="preserve"> Praktikum</w:t>
                             </w:r>
-                            <w:proofErr w:type="spellStart"/>
-                            <w:r>
-                              <w:rPr>
-                                <w:rFonts w:asciiTheme="minorHAnsi" w:hAnsiTheme="minorHAnsi"/>
-                                <w:sz w:val="28"/>
-                                <w:szCs w:val="28"/>
-                              </w:rPr>
-                              <w:t>Praktikum</w:t>
-                            </w:r>
-                            <w:proofErr w:type="spellEnd"/>
                           </w:p>
                         </w:txbxContent>
                       </wps:txbx>
@@ -177,7 +166,7 @@
                 <v:stroke joinstyle="miter"/>
                 <v:path gradientshapeok="t" o:connecttype="rect"/>
               </v:shapetype>
-              <v:shape id="Text Box 441" o:spid="_x0000_s1026" type="#_x0000_t202" style="position:absolute;margin-left:-5.8pt;margin-top:-9.5pt;width:136.55pt;height:26.05pt;z-index:251655168;visibility:visible;mso-wrap-style:square;mso-width-percent:0;mso-height-percent:0;mso-wrap-distance-left:9pt;mso-wrap-distance-top:0;mso-wrap-distance-right:9pt;mso-wrap-distance-bottom:0;mso-position-horizontal:absolute;mso-position-horizontal-relative:text;mso-position-vertical:absolute;mso-position-vertical-relative:text;mso-width-percent:0;mso-height-percent:0;mso-width-relative:page;mso-height-relative:page;v-text-anchor:top" o:gfxdata="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" filled="f" stroked="f">
+              <v:shape id="Text Box 441" o:spid="_x0000_s1026" type="#_x0000_t202" style="position:absolute;margin-left:-5.8pt;margin-top:-9.5pt;width:136.55pt;height:26.05pt;z-index:251655168;visibility:visible;mso-wrap-style:square;mso-width-percent:0;mso-height-percent:0;mso-wrap-distance-left:9pt;mso-wrap-distance-top:0;mso-wrap-distance-right:9pt;mso-wrap-distance-bottom:0;mso-position-horizontal:absolute;mso-position-horizontal-relative:text;mso-position-vertical:absolute;mso-position-vertical-relative:text;mso-width-percent:0;mso-height-percent:0;mso-width-relative:page;mso-height-relative:page;v-text-anchor:top" o:gfxdata="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" filled="f" stroked="f">
                 <v:textbox>
                   <w:txbxContent>
                     <w:p>
@@ -188,7 +177,6 @@
                           <w:szCs w:val="28"/>
                         </w:rPr>
                       </w:pPr>
-                      <w:proofErr w:type="spellStart"/>
                       <w:r>
                         <w:rPr>
                           <w:rFonts w:asciiTheme="minorHAnsi" w:hAnsiTheme="minorHAnsi"/>
@@ -197,25 +185,14 @@
                         </w:rPr>
                         <w:t>Laporan</w:t>
                       </w:r>
-                      <w:proofErr w:type="spellEnd"/>
                       <w:r>
                         <w:rPr>
                           <w:rFonts w:asciiTheme="minorHAnsi" w:hAnsiTheme="minorHAnsi"/>
                           <w:sz w:val="28"/>
                           <w:szCs w:val="28"/>
                         </w:rPr>
-                        <w:t xml:space="preserve"> </w:t>
+                        <w:t xml:space="preserve"> Praktikum</w:t>
                       </w:r>
-                      <w:proofErr w:type="spellStart"/>
-                      <w:r>
-                        <w:rPr>
-                          <w:rFonts w:asciiTheme="minorHAnsi" w:hAnsiTheme="minorHAnsi"/>
-                          <w:sz w:val="28"/>
-                          <w:szCs w:val="28"/>
-                        </w:rPr>
-                        <w:t>Praktikum</w:t>
-                      </w:r>
-                      <w:proofErr w:type="spellEnd"/>
                     </w:p>
                   </w:txbxContent>
                 </v:textbox>
@@ -254,7 +231,6 @@
           <w:lang w:val="fi-FI"/>
         </w:rPr>
       </w:pPr>
-      <w:proofErr w:type="spellStart"/>
       <w:r>
         <w:rPr>
           <w:sz w:val="40"/>
@@ -262,39 +238,20 @@
         </w:rPr>
         <w:t>Laporan</w:t>
       </w:r>
-      <w:proofErr w:type="spellEnd"/>
       <w:r>
         <w:rPr>
           <w:sz w:val="40"/>
           <w:lang w:val="fi-FI"/>
         </w:rPr>
-        <w:t xml:space="preserve"> </w:t>
+        <w:t xml:space="preserve"> Praktikum</w:t>
       </w:r>
-      <w:proofErr w:type="spellStart"/>
       <w:r>
         <w:rPr>
           <w:sz w:val="40"/>
           <w:lang w:val="fi-FI"/>
         </w:rPr>
-        <w:t>Praktikum</w:t>
+        <w:t>/Lab</w:t>
       </w:r>
-      <w:proofErr w:type="spellEnd"/>
-      <w:r>
-        <w:rPr>
-          <w:sz w:val="40"/>
-          <w:lang w:val="fi-FI"/>
-        </w:rPr>
-        <w:t>/</w:t>
-      </w:r>
-      <w:proofErr w:type="spellStart"/>
-      <w:r>
-        <w:rPr>
-          <w:sz w:val="40"/>
-          <w:lang w:val="fi-FI"/>
-        </w:rPr>
-        <w:t>Lab</w:t>
-      </w:r>
-      <w:proofErr w:type="spellEnd"/>
     </w:p>
     <w:p>
       <w:pPr>
@@ -312,7 +269,6 @@
           <w:lang w:val="fi-FI"/>
         </w:rPr>
       </w:pPr>
-      <w:proofErr w:type="spellStart"/>
       <w:r>
         <w:rPr>
           <w:rFonts w:ascii="Bernard MT Condensed" w:hAnsi="Bernard MT Condensed"/>
@@ -323,35 +279,8 @@
           <w:szCs w:val="48"/>
           <w:lang w:val="fi-FI"/>
         </w:rPr>
-        <w:t>Judul</w:t>
+        <w:t>Judul Praktikum</w:t>
       </w:r>
-      <w:proofErr w:type="spellEnd"/>
-      <w:r>
-        <w:rPr>
-          <w:rFonts w:ascii="Bernard MT Condensed" w:hAnsi="Bernard MT Condensed"/>
-          <w:b/>
-          <w:spacing w:val="0"/>
-          <w:kern w:val="0"/>
-          <w:sz w:val="48"/>
-          <w:szCs w:val="48"/>
-          <w:lang w:val="fi-FI"/>
-        </w:rPr>
-        <w:t xml:space="preserve"> </w:t>
-      </w:r>
-      <w:proofErr w:type="spellStart"/>
-      <w:r>
-        <w:rPr>
-          <w:rFonts w:ascii="Bernard MT Condensed" w:hAnsi="Bernard MT Condensed"/>
-          <w:b/>
-          <w:spacing w:val="0"/>
-          <w:kern w:val="0"/>
-          <w:sz w:val="48"/>
-          <w:szCs w:val="48"/>
-          <w:lang w:val="fi-FI"/>
-        </w:rPr>
-        <w:t>Praktikum</w:t>
-      </w:r>
-      <w:proofErr w:type="spellEnd"/>
     </w:p>
     <w:p>
       <w:pPr>
@@ -396,7 +325,6 @@
           <w:lang w:val="sv-SE"/>
         </w:rPr>
       </w:pPr>
-      <w:proofErr w:type="spellStart"/>
       <w:r>
         <w:rPr>
           <w:b/>
@@ -405,10 +333,12 @@
           <w:szCs w:val="32"/>
           <w:lang w:val="sv-SE"/>
         </w:rPr>
-        <w:t>Nama</w:t>
+        <w:t>Gede Valendra</w:t>
       </w:r>
-      <w:proofErr w:type="spellEnd"/>
-      <w:r>
+    </w:p>
+    <w:p>
+      <w:pPr>
+        <w:jc w:val="right"/>
         <w:rPr>
           <w:b/>
           <w:kern w:val="28"/>
@@ -416,9 +346,7 @@
           <w:szCs w:val="32"/>
           <w:lang w:val="sv-SE"/>
         </w:rPr>
-        <w:t xml:space="preserve"> </w:t>
-      </w:r>
-      <w:proofErr w:type="spellStart"/>
+      </w:pPr>
       <w:r>
         <w:rPr>
           <w:b/>
@@ -427,10 +355,12 @@
           <w:szCs w:val="32"/>
           <w:lang w:val="sv-SE"/>
         </w:rPr>
-        <w:t>Peserta</w:t>
+        <w:t>RC</w:t>
       </w:r>
-      <w:proofErr w:type="spellEnd"/>
-      <w:r>
+    </w:p>
+    <w:p>
+      <w:pPr>
+        <w:jc w:val="right"/>
         <w:rPr>
           <w:b/>
           <w:kern w:val="28"/>
@@ -438,9 +368,7 @@
           <w:szCs w:val="32"/>
           <w:lang w:val="sv-SE"/>
         </w:rPr>
-        <w:t xml:space="preserve"> </w:t>
-      </w:r>
-      <w:proofErr w:type="spellStart"/>
+      </w:pPr>
       <w:r>
         <w:rPr>
           <w:b/>
@@ -449,52 +377,7 @@
           <w:szCs w:val="32"/>
           <w:lang w:val="sv-SE"/>
         </w:rPr>
-        <w:t>Praktikum</w:t>
-      </w:r>
-      <w:proofErr w:type="spellEnd"/>
-    </w:p>
-    <w:p>
-      <w:pPr>
-        <w:jc w:val="right"/>
-        <w:rPr>
-          <w:b/>
-          <w:kern w:val="28"/>
-          <w:sz w:val="28"/>
-          <w:szCs w:val="32"/>
-          <w:lang w:val="sv-SE"/>
-        </w:rPr>
-      </w:pPr>
-      <w:r>
-        <w:rPr>
-          <w:b/>
-          <w:kern w:val="28"/>
-          <w:sz w:val="28"/>
-          <w:szCs w:val="32"/>
-          <w:lang w:val="sv-SE"/>
-        </w:rPr>
-        <w:t>RA/RB/RC/RD</w:t>
-      </w:r>
-    </w:p>
-    <w:p>
-      <w:pPr>
-        <w:jc w:val="right"/>
-        <w:rPr>
-          <w:b/>
-          <w:kern w:val="28"/>
-          <w:sz w:val="28"/>
-          <w:szCs w:val="32"/>
-          <w:lang w:val="sv-SE"/>
-        </w:rPr>
-      </w:pPr>
-      <w:r>
-        <w:rPr>
-          <w:b/>
-          <w:kern w:val="28"/>
-          <w:sz w:val="28"/>
-          <w:szCs w:val="32"/>
-          <w:lang w:val="sv-SE"/>
-        </w:rPr>
-        <w:t>NIM</w:t>
+        <w:t>124140142</w:t>
       </w:r>
     </w:p>
     <w:p>
@@ -531,7 +414,6 @@
         </w:rPr>
         <w:t xml:space="preserve">Tim </w:t>
       </w:r>
-      <w:proofErr w:type="spellStart"/>
       <w:r>
         <w:rPr>
           <w:b/>
@@ -543,7 +425,6 @@
         </w:rPr>
         <w:t>Asisten</w:t>
       </w:r>
-      <w:proofErr w:type="spellEnd"/>
     </w:p>
     <w:p>
       <w:pPr>
@@ -556,8 +437,19 @@
           <w:lang w:val="sv-SE"/>
         </w:rPr>
       </w:pPr>
-      <w:proofErr w:type="spellStart"/>
       <w:r>
+        <w:rPr>
+          <w:b/>
+          <w:kern w:val="28"/>
+          <w:sz w:val="28"/>
+          <w:szCs w:val="32"/>
+        </w:rPr>
+        <w:t>Daniel Calvin Simanjuntak</w:t>
+      </w:r>
+    </w:p>
+    <w:p>
+      <w:pPr>
+        <w:jc w:val="right"/>
         <w:rPr>
           <w:b/>
           <w:kern w:val="28"/>
@@ -565,10 +457,56 @@
           <w:szCs w:val="32"/>
           <w:lang w:val="sv-SE"/>
         </w:rPr>
-        <w:t>Nama</w:t>
+      </w:pPr>
+      <w:r>
+        <w:rPr>
+          <w:b/>
+          <w:kern w:val="28"/>
+          <w:sz w:val="28"/>
+          <w:szCs w:val="32"/>
+        </w:rPr>
+        <w:t>Zakhi Algifari</w:t>
       </w:r>
-      <w:proofErr w:type="spellEnd"/>
-      <w:r>
+    </w:p>
+    <w:p>
+      <w:pPr>
+        <w:rPr>
+          <w:b/>
+          <w:kern w:val="28"/>
+          <w:sz w:val="32"/>
+          <w:szCs w:val="32"/>
+          <w:lang w:val="sv-SE"/>
+        </w:rPr>
+      </w:pPr>
+    </w:p>
+    <w:p>
+      <w:pPr>
+        <w:jc w:val="right"/>
+        <w:rPr>
+          <w:b/>
+          <w:kern w:val="28"/>
+          <w:sz w:val="32"/>
+          <w:szCs w:val="32"/>
+          <w:lang w:val="sv-SE"/>
+        </w:rPr>
+      </w:pPr>
+    </w:p>
+    <w:p>
+      <w:pPr>
+        <w:jc w:val="right"/>
+        <w:rPr>
+          <w:b/>
+          <w:kern w:val="28"/>
+          <w:sz w:val="32"/>
+          <w:szCs w:val="32"/>
+          <w:lang w:val="sv-SE"/>
+        </w:rPr>
+      </w:pPr>
+    </w:p>
+    <w:p>
+      <w:pPr>
+        <w:ind w:right="-17" w:firstLine="720"/>
+        <w:jc w:val="right"/>
         <w:rPr>
           <w:b/>
           <w:kern w:val="28"/>
@@ -576,9 +514,7 @@
           <w:szCs w:val="32"/>
           <w:lang w:val="sv-SE"/>
         </w:rPr>
-        <w:t xml:space="preserve"> </w:t>
-      </w:r>
-      <w:proofErr w:type="spellStart"/>
+      </w:pPr>
       <w:r>
         <w:rPr>
           <w:b/>
@@ -587,9 +523,8 @@
           <w:szCs w:val="32"/>
           <w:lang w:val="sv-SE"/>
         </w:rPr>
-        <w:t>Asisten</w:t>
+        <w:t xml:space="preserve">       </w:t>
       </w:r>
-      <w:proofErr w:type="spellEnd"/>
       <w:r>
         <w:rPr>
           <w:b/>
@@ -598,10 +533,12 @@
           <w:szCs w:val="32"/>
           <w:lang w:val="sv-SE"/>
         </w:rPr>
-        <w:t xml:space="preserve"> </w:t>
+        <w:t>Teknik Informatika</w:t>
       </w:r>
-      <w:proofErr w:type="spellStart"/>
-      <w:r>
+    </w:p>
+    <w:p>
+      <w:pPr>
+        <w:jc w:val="right"/>
         <w:rPr>
           <w:b/>
           <w:kern w:val="28"/>
@@ -609,9 +546,7 @@
           <w:szCs w:val="32"/>
           <w:lang w:val="sv-SE"/>
         </w:rPr>
-        <w:t>Praktikum</w:t>
-      </w:r>
-      <w:proofErr w:type="spellEnd"/>
+      </w:pPr>
       <w:r>
         <w:rPr>
           <w:b/>
@@ -620,190 +555,8 @@
           <w:szCs w:val="32"/>
           <w:lang w:val="sv-SE"/>
         </w:rPr>
-        <w:t xml:space="preserve"> 1</w:t>
-      </w:r>
-    </w:p>
-    <w:p>
-      <w:pPr>
-        <w:jc w:val="right"/>
-        <w:rPr>
-          <w:b/>
-          <w:kern w:val="28"/>
-          <w:sz w:val="28"/>
-          <w:szCs w:val="32"/>
-          <w:lang w:val="sv-SE"/>
-        </w:rPr>
-      </w:pPr>
-      <w:proofErr w:type="spellStart"/>
-      <w:r>
-        <w:rPr>
-          <w:b/>
-          <w:kern w:val="28"/>
-          <w:sz w:val="28"/>
-          <w:szCs w:val="32"/>
-          <w:lang w:val="sv-SE"/>
-        </w:rPr>
-        <w:t>Nama</w:t>
-      </w:r>
-      <w:proofErr w:type="spellEnd"/>
-      <w:r>
-        <w:rPr>
-          <w:b/>
-          <w:kern w:val="28"/>
-          <w:sz w:val="28"/>
-          <w:szCs w:val="32"/>
-          <w:lang w:val="sv-SE"/>
-        </w:rPr>
-        <w:t xml:space="preserve"> </w:t>
-      </w:r>
-      <w:proofErr w:type="spellStart"/>
-      <w:r>
-        <w:rPr>
-          <w:b/>
-          <w:kern w:val="28"/>
-          <w:sz w:val="28"/>
-          <w:szCs w:val="32"/>
-          <w:lang w:val="sv-SE"/>
-        </w:rPr>
-        <w:t>Asisten</w:t>
-      </w:r>
-      <w:proofErr w:type="spellEnd"/>
-      <w:r>
-        <w:rPr>
-          <w:b/>
-          <w:kern w:val="28"/>
-          <w:sz w:val="28"/>
-          <w:szCs w:val="32"/>
-          <w:lang w:val="sv-SE"/>
-        </w:rPr>
-        <w:t xml:space="preserve"> </w:t>
-      </w:r>
-      <w:proofErr w:type="spellStart"/>
-      <w:r>
-        <w:rPr>
-          <w:b/>
-          <w:kern w:val="28"/>
-          <w:sz w:val="28"/>
-          <w:szCs w:val="32"/>
-          <w:lang w:val="sv-SE"/>
-        </w:rPr>
-        <w:t>Praktikum</w:t>
-      </w:r>
-      <w:proofErr w:type="spellEnd"/>
-      <w:r>
-        <w:rPr>
-          <w:b/>
-          <w:kern w:val="28"/>
-          <w:sz w:val="28"/>
-          <w:szCs w:val="32"/>
-          <w:lang w:val="sv-SE"/>
-        </w:rPr>
-        <w:t xml:space="preserve"> 2</w:t>
-      </w:r>
-    </w:p>
-    <w:p>
-      <w:pPr>
-        <w:rPr>
-          <w:b/>
-          <w:kern w:val="28"/>
-          <w:sz w:val="32"/>
-          <w:szCs w:val="32"/>
-          <w:lang w:val="sv-SE"/>
-        </w:rPr>
-      </w:pPr>
-    </w:p>
-    <w:p>
-      <w:pPr>
-        <w:jc w:val="right"/>
-        <w:rPr>
-          <w:b/>
-          <w:kern w:val="28"/>
-          <w:sz w:val="32"/>
-          <w:szCs w:val="32"/>
-          <w:lang w:val="sv-SE"/>
-        </w:rPr>
-      </w:pPr>
-    </w:p>
-    <w:p>
-      <w:pPr>
-        <w:jc w:val="right"/>
-        <w:rPr>
-          <w:b/>
-          <w:kern w:val="28"/>
-          <w:sz w:val="32"/>
-          <w:szCs w:val="32"/>
-          <w:lang w:val="sv-SE"/>
-        </w:rPr>
-      </w:pPr>
-    </w:p>
-    <w:p>
-      <w:pPr>
-        <w:ind w:right="-17" w:firstLine="720"/>
-        <w:jc w:val="right"/>
-        <w:rPr>
-          <w:b/>
-          <w:kern w:val="28"/>
-          <w:sz w:val="28"/>
-          <w:szCs w:val="32"/>
-          <w:lang w:val="sv-SE"/>
-        </w:rPr>
-      </w:pPr>
-      <w:r>
-        <w:rPr>
-          <w:b/>
-          <w:kern w:val="28"/>
-          <w:sz w:val="28"/>
-          <w:szCs w:val="32"/>
-          <w:lang w:val="sv-SE"/>
-        </w:rPr>
-        <w:t xml:space="preserve">       </w:t>
-      </w:r>
-      <w:r>
-        <w:rPr>
-          <w:b/>
-          <w:kern w:val="28"/>
-          <w:sz w:val="28"/>
-          <w:szCs w:val="32"/>
-          <w:lang w:val="sv-SE"/>
-        </w:rPr>
-        <w:t xml:space="preserve">Teknik </w:t>
-      </w:r>
-      <w:proofErr w:type="spellStart"/>
-      <w:r>
-        <w:rPr>
-          <w:b/>
-          <w:kern w:val="28"/>
-          <w:sz w:val="28"/>
-          <w:szCs w:val="32"/>
-          <w:lang w:val="sv-SE"/>
-        </w:rPr>
-        <w:t>Informatika</w:t>
-      </w:r>
-      <w:proofErr w:type="spellEnd"/>
-    </w:p>
-    <w:p>
-      <w:pPr>
-        <w:jc w:val="right"/>
-        <w:rPr>
-          <w:b/>
-          <w:kern w:val="28"/>
-          <w:sz w:val="28"/>
-          <w:szCs w:val="32"/>
-          <w:lang w:val="sv-SE"/>
-        </w:rPr>
-      </w:pPr>
-      <w:proofErr w:type="spellStart"/>
-      <w:r>
-        <w:rPr>
-          <w:b/>
-          <w:kern w:val="28"/>
-          <w:sz w:val="28"/>
-          <w:szCs w:val="32"/>
-          <w:lang w:val="sv-SE"/>
-        </w:rPr>
         <w:t>Fakultas</w:t>
       </w:r>
-      <w:proofErr w:type="spellEnd"/>
       <w:r>
         <w:rPr>
           <w:b/>
@@ -940,20 +693,8 @@
           <w:szCs w:val="32"/>
           <w:lang w:val="sv-SE"/>
         </w:rPr>
-        <w:t xml:space="preserve">Teknologi </w:t>
+        <w:t>Teknologi Sumatera</w:t>
       </w:r>
-      <w:proofErr w:type="spellStart"/>
-      <w:r>
-        <w:rPr>
-          <w:b/>
-          <w:kern w:val="28"/>
-          <w:sz w:val="28"/>
-          <w:szCs w:val="32"/>
-          <w:lang w:val="sv-SE"/>
-        </w:rPr>
-        <w:t>Sumatera</w:t>
-      </w:r>
-      <w:proofErr w:type="spellEnd"/>
     </w:p>
     <w:p>
       <w:pPr>
@@ -1119,7 +860,17 @@
           <w:szCs w:val="32"/>
           <w:lang w:val="sv-SE"/>
         </w:rPr>
-        <w:t>2025</w:t>
+        <w:t>202</w:t>
+      </w:r>
+      <w:r>
+        <w:rPr>
+          <w:b/>
+          <w:kern w:val="28"/>
+          <w:sz w:val="28"/>
+          <w:szCs w:val="32"/>
+          <w:lang w:val="sv-SE"/>
+        </w:rPr>
+        <w:t>6</w:t>
       </w:r>
     </w:p>
     <w:p>
@@ -1147,15 +898,27 @@
       <w:pPr>
         <w:pStyle w:val="Subtitle"/>
         <w:spacing w:before="1320"/>
+        <w:rPr>
+          <w:lang w:val="sv-SE"/>
+        </w:rPr>
       </w:pPr>
       <w:r>
+        <w:rPr>
+          <w:lang w:val="sv-SE"/>
+        </w:rPr>
         <w:lastRenderedPageBreak/>
         <w:t>Fakultas</w:t>
       </w:r>
       <w:r>
+        <w:rPr>
+          <w:lang w:val="sv-SE"/>
+        </w:rPr>
         <w:t xml:space="preserve"> </w:t>
       </w:r>
       <w:r>
+        <w:rPr>
+          <w:lang w:val="sv-SE"/>
+        </w:rPr>
         <w:t>teknologi industri</w:t>
       </w:r>
     </w:p>
@@ -1163,18 +926,36 @@
       <w:pPr>
         <w:pStyle w:val="Subtitle"/>
         <w:spacing w:before="120" w:after="720"/>
+        <w:rPr>
+          <w:lang w:val="sv-SE"/>
+        </w:rPr>
       </w:pPr>
       <w:r>
+        <w:rPr>
+          <w:lang w:val="sv-SE"/>
+        </w:rPr>
         <w:t xml:space="preserve">itera </w:t>
       </w:r>
       <w:r>
-        <w:t>2025</w:t>
+        <w:rPr>
+          <w:lang w:val="sv-SE"/>
+        </w:rPr>
+        <w:t>202</w:t>
+      </w:r>
+      <w:r>
+        <w:rPr>
+          <w:lang w:val="sv-SE"/>
+        </w:rPr>
+        <w:t>6</w:t>
       </w:r>
     </w:p>
     <w:p>
       <w:pPr>
         <w:pStyle w:val="Title"/>
         <w:spacing w:after="2760"/>
+        <w:rPr>
+          <w:lang w:val="sv-SE"/>
+        </w:rPr>
       </w:pPr>
       <w:r>
         <w:rPr>
@@ -1188,69 +969,11 @@
         </w:rPr>
         <w:t xml:space="preserve"> </w:t>
       </w:r>
-      <w:proofErr w:type="spellStart"/>
       <w:r>
         <w:rPr>
           <w:lang w:val="sv-SE"/>
         </w:rPr>
-        <w:t>Judul</w:t>
-      </w:r>
-      <w:proofErr w:type="spellEnd"/>
-      <w:r>
-        <w:rPr>
-          <w:lang w:val="sv-SE"/>
-        </w:rPr>
-        <w:t xml:space="preserve"> </w:t>
-      </w:r>
-      <w:proofErr w:type="spellStart"/>
-      <w:r>
-        <w:rPr>
-          <w:lang w:val="sv-SE"/>
-        </w:rPr>
-        <w:t>Praktikum</w:t>
-      </w:r>
-      <w:proofErr w:type="spellEnd"/>
-    </w:p>
-    <w:p>
-      <w:pPr>
-        <w:pStyle w:val="ReturnAddress"/>
-        <w:rPr>
-          <w:b/>
-        </w:rPr>
-      </w:pPr>
-      <w:r>
-        <w:rPr>
-          <w:b/>
-        </w:rPr>
-        <w:t xml:space="preserve">Nama </w:t>
-      </w:r>
-      <w:proofErr w:type="spellStart"/>
-      <w:r>
-        <w:rPr>
-          <w:b/>
-        </w:rPr>
-        <w:t>anggota</w:t>
-      </w:r>
-      <w:proofErr w:type="spellEnd"/>
-      <w:r>
-        <w:rPr>
-          <w:b/>
-        </w:rPr>
-        <w:t xml:space="preserve"> </w:t>
-      </w:r>
-      <w:proofErr w:type="spellStart"/>
-      <w:r>
-        <w:rPr>
-          <w:b/>
-        </w:rPr>
-        <w:t>kelompok</w:t>
-      </w:r>
-      <w:proofErr w:type="spellEnd"/>
-      <w:r>
-        <w:rPr>
-          <w:b/>
-        </w:rPr>
-        <w:t xml:space="preserve">: </w:t>
+        <w:t>Judul Praktikum</w:t>
       </w:r>
     </w:p>
     <w:p>
@@ -1258,27 +981,15 @@
         <w:pStyle w:val="ReturnAddress"/>
         <w:rPr>
           <w:b/>
+          <w:lang w:val="sv-SE"/>
         </w:rPr>
       </w:pPr>
       <w:r>
         <w:rPr>
           <w:b/>
-        </w:rPr>
-        <w:t xml:space="preserve">Nama </w:t>
-      </w:r>
-      <w:proofErr w:type="spellStart"/>
-      <w:r>
-        <w:rPr>
-          <w:b/>
-        </w:rPr>
-        <w:t>Mahasiswa</w:t>
-      </w:r>
-      <w:proofErr w:type="spellEnd"/>
-      <w:r>
-        <w:rPr>
-          <w:b/>
-        </w:rPr>
-        <w:t xml:space="preserve"> (NIM)</w:t>
+          <w:lang w:val="sv-SE"/>
+        </w:rPr>
+        <w:t>Gede Valendra (124140142)</w:t>
       </w:r>
     </w:p>
     <w:p>
@@ -1286,27 +997,24 @@
         <w:pStyle w:val="ReturnAddress"/>
         <w:rPr>
           <w:b/>
+          <w:lang w:val="sv-SE"/>
+        </w:rPr>
+      </w:pPr>
+    </w:p>
+    <w:p>
+      <w:pPr>
+        <w:pStyle w:val="ReturnAddress"/>
+        <w:rPr>
+          <w:b/>
+          <w:lang w:val="sv-SE"/>
         </w:rPr>
       </w:pPr>
       <w:r>
         <w:rPr>
           <w:b/>
-        </w:rPr>
-        <w:t xml:space="preserve">Nama </w:t>
-      </w:r>
-      <w:proofErr w:type="spellStart"/>
-      <w:r>
-        <w:rPr>
-          <w:b/>
-        </w:rPr>
-        <w:t>Mahasiswa</w:t>
-      </w:r>
-      <w:proofErr w:type="spellEnd"/>
-      <w:r>
-        <w:rPr>
-          <w:b/>
-        </w:rPr>
-        <w:t xml:space="preserve"> (NIM)</w:t>
+          <w:lang w:val="sv-SE"/>
+        </w:rPr>
+        <w:t>Jika tugas individu cukup tulis nama dan nim saja</w:t>
       </w:r>
     </w:p>
     <w:p>
@@ -1314,464 +1022,218 @@
         <w:pStyle w:val="ReturnAddress"/>
         <w:rPr>
           <w:b/>
-        </w:rPr>
-      </w:pPr>
-      <w:r>
-        <w:rPr>
-          <w:b/>
-        </w:rPr>
-        <w:t xml:space="preserve">Nama </w:t>
-      </w:r>
-      <w:proofErr w:type="spellStart"/>
-      <w:r>
-        <w:rPr>
-          <w:b/>
-        </w:rPr>
-        <w:t>Mahasiswa</w:t>
-      </w:r>
-      <w:proofErr w:type="spellEnd"/>
-      <w:r>
-        <w:rPr>
-          <w:b/>
-        </w:rPr>
-        <w:t xml:space="preserve"> (NIM)</w:t>
-      </w:r>
+          <w:lang w:val="sv-SE"/>
+        </w:rPr>
+      </w:pPr>
     </w:p>
     <w:p>
       <w:pPr>
         <w:pStyle w:val="ReturnAddress"/>
         <w:rPr>
           <w:b/>
-        </w:rPr>
-      </w:pPr>
-      <w:r>
-        <w:rPr>
-          <w:b/>
-        </w:rPr>
-        <w:t xml:space="preserve">Nama </w:t>
-      </w:r>
-      <w:proofErr w:type="spellStart"/>
-      <w:r>
-        <w:rPr>
-          <w:b/>
-        </w:rPr>
-        <w:t>Mahasiswa</w:t>
-      </w:r>
-      <w:proofErr w:type="spellEnd"/>
-      <w:r>
-        <w:rPr>
-          <w:b/>
-        </w:rPr>
-        <w:t xml:space="preserve"> (NIM)</w:t>
-      </w:r>
+          <w:lang w:val="sv-SE"/>
+        </w:rPr>
+      </w:pPr>
     </w:p>
     <w:p>
       <w:pPr>
         <w:pStyle w:val="ReturnAddress"/>
         <w:rPr>
-          <w:b/>
+          <w:lang w:val="sv-SE"/>
         </w:rPr>
       </w:pPr>
       <w:r>
         <w:rPr>
-          <w:b/>
-        </w:rPr>
-        <w:t xml:space="preserve">Nama </w:t>
-      </w:r>
-      <w:proofErr w:type="spellStart"/>
-      <w:r>
-        <w:rPr>
-          <w:b/>
-        </w:rPr>
-        <w:t>Mahasiswa</w:t>
-      </w:r>
-      <w:proofErr w:type="spellEnd"/>
-      <w:r>
-        <w:rPr>
-          <w:b/>
-        </w:rPr>
-        <w:t xml:space="preserve"> (NIM)</w:t>
-      </w:r>
-    </w:p>
-    <w:p>
-      <w:pPr>
-        <w:pStyle w:val="ReturnAddress"/>
-        <w:rPr>
-          <w:b/>
-        </w:rPr>
-      </w:pPr>
-      <w:r>
-        <w:rPr>
-          <w:b/>
-        </w:rPr>
-        <w:t xml:space="preserve">Nama </w:t>
-      </w:r>
-      <w:proofErr w:type="spellStart"/>
-      <w:r>
-        <w:rPr>
-          <w:b/>
-        </w:rPr>
-        <w:t>Mahasiswa</w:t>
-      </w:r>
-      <w:proofErr w:type="spellEnd"/>
-      <w:r>
-        <w:rPr>
-          <w:b/>
-        </w:rPr>
-        <w:t xml:space="preserve"> (NIM)</w:t>
-      </w:r>
-    </w:p>
-    <w:p>
-      <w:pPr>
-        <w:pStyle w:val="ReturnAddress"/>
-        <w:rPr>
-          <w:b/>
-        </w:rPr>
-      </w:pPr>
-      <w:r>
-        <w:rPr>
-          <w:b/>
-        </w:rPr>
-        <w:t xml:space="preserve">Nama </w:t>
-      </w:r>
-      <w:proofErr w:type="spellStart"/>
-      <w:r>
-        <w:rPr>
-          <w:b/>
-        </w:rPr>
-        <w:t>Mahasiswa</w:t>
-      </w:r>
-      <w:proofErr w:type="spellEnd"/>
-      <w:r>
-        <w:rPr>
-          <w:b/>
-        </w:rPr>
-        <w:t xml:space="preserve"> (NIM)</w:t>
-      </w:r>
-    </w:p>
-    <w:p>
-      <w:pPr>
-        <w:pStyle w:val="ReturnAddress"/>
-        <w:rPr>
-          <w:b/>
-        </w:rPr>
-      </w:pPr>
-      <w:r>
-        <w:rPr>
-          <w:b/>
-        </w:rPr>
-        <w:t xml:space="preserve">Nama </w:t>
-      </w:r>
-      <w:proofErr w:type="spellStart"/>
-      <w:r>
-        <w:rPr>
-          <w:b/>
-        </w:rPr>
-        <w:t>Mahasiswa</w:t>
-      </w:r>
-      <w:proofErr w:type="spellEnd"/>
-      <w:r>
-        <w:rPr>
-          <w:b/>
-        </w:rPr>
-        <w:t xml:space="preserve"> (NIM)</w:t>
-      </w:r>
-    </w:p>
-    <w:p>
-      <w:pPr>
-        <w:pStyle w:val="ReturnAddress"/>
-        <w:rPr>
-          <w:b/>
-        </w:rPr>
-      </w:pPr>
-      <w:r>
-        <w:rPr>
-          <w:b/>
-        </w:rPr>
-        <w:t xml:space="preserve">Nama </w:t>
-      </w:r>
-      <w:proofErr w:type="spellStart"/>
-      <w:r>
-        <w:rPr>
-          <w:b/>
-        </w:rPr>
-        <w:t>Mahasiswa</w:t>
-      </w:r>
-      <w:proofErr w:type="spellEnd"/>
-      <w:r>
-        <w:rPr>
-          <w:b/>
-        </w:rPr>
-        <w:t xml:space="preserve"> (</w:t>
-      </w:r>
-      <w:r>
-        <w:rPr>
-          <w:b/>
-        </w:rPr>
-        <w:t>NIM</w:t>
-      </w:r>
-      <w:r>
-        <w:rPr>
-          <w:b/>
-        </w:rPr>
-        <w:t>)</w:t>
-      </w:r>
-    </w:p>
-    <w:p>
-      <w:pPr>
-        <w:pStyle w:val="ReturnAddress"/>
-        <w:rPr>
-          <w:b/>
-        </w:rPr>
-      </w:pPr>
-    </w:p>
-    <w:p>
-      <w:pPr>
-        <w:pStyle w:val="ReturnAddress"/>
-        <w:rPr>
-          <w:b/>
-        </w:rPr>
-      </w:pPr>
-      <w:r>
-        <w:rPr>
-          <w:b/>
-        </w:rPr>
-        <w:t xml:space="preserve">Jika </w:t>
-      </w:r>
-      <w:proofErr w:type="spellStart"/>
-      <w:r>
-        <w:rPr>
-          <w:b/>
-        </w:rPr>
-        <w:t>tugas</w:t>
-      </w:r>
-      <w:proofErr w:type="spellEnd"/>
-      <w:r>
-        <w:rPr>
-          <w:b/>
-        </w:rPr>
-        <w:t xml:space="preserve"> </w:t>
-      </w:r>
-      <w:proofErr w:type="spellStart"/>
-      <w:r>
-        <w:rPr>
-          <w:b/>
-        </w:rPr>
-        <w:t>individu</w:t>
-      </w:r>
-      <w:proofErr w:type="spellEnd"/>
-      <w:r>
-        <w:rPr>
-          <w:b/>
-        </w:rPr>
-        <w:t xml:space="preserve"> </w:t>
-      </w:r>
-      <w:proofErr w:type="spellStart"/>
-      <w:r>
-        <w:rPr>
-          <w:b/>
-        </w:rPr>
-        <w:t>cukup</w:t>
-      </w:r>
-      <w:proofErr w:type="spellEnd"/>
-      <w:r>
-        <w:rPr>
-          <w:b/>
-        </w:rPr>
-        <w:t xml:space="preserve"> </w:t>
-      </w:r>
-      <w:proofErr w:type="spellStart"/>
-      <w:r>
-        <w:rPr>
-          <w:b/>
-        </w:rPr>
-        <w:t>tulis</w:t>
-      </w:r>
-      <w:proofErr w:type="spellEnd"/>
-      <w:r>
-        <w:rPr>
-          <w:b/>
-        </w:rPr>
-        <w:t xml:space="preserve"> nama dan nim </w:t>
-      </w:r>
-      <w:proofErr w:type="spellStart"/>
-      <w:r>
-        <w:rPr>
-          <w:b/>
-        </w:rPr>
-        <w:t>saja</w:t>
-      </w:r>
-      <w:proofErr w:type="spellEnd"/>
-    </w:p>
-    <w:p>
-      <w:pPr>
-        <w:pStyle w:val="ReturnAddress"/>
-        <w:rPr>
-          <w:b/>
-        </w:rPr>
-      </w:pPr>
-    </w:p>
-    <w:p>
-      <w:pPr>
-        <w:pStyle w:val="ReturnAddress"/>
-        <w:rPr>
-          <w:b/>
-        </w:rPr>
-      </w:pPr>
-    </w:p>
-    <w:p>
-      <w:pPr>
-        <w:pStyle w:val="ReturnAddress"/>
-      </w:pPr>
-      <w:r>
+          <w:lang w:val="sv-SE"/>
+        </w:rPr>
         <w:t>ITERA</w:t>
       </w:r>
       <w:r>
+        <w:rPr>
+          <w:lang w:val="sv-SE"/>
+        </w:rPr>
         <w:t xml:space="preserve"> Laboratory</w:t>
       </w:r>
     </w:p>
     <w:p>
       <w:pPr>
         <w:pStyle w:val="ReturnAddress"/>
+        <w:rPr>
+          <w:lang w:val="sv-SE"/>
+        </w:rPr>
       </w:pPr>
       <w:r>
-        <w:t xml:space="preserve">Program Studi Teknik </w:t>
+        <w:rPr>
+          <w:lang w:val="sv-SE"/>
+        </w:rPr>
+        <w:t>Program Studi Teknik Informatika</w:t>
       </w:r>
-      <w:proofErr w:type="spellStart"/>
-      <w:r>
-        <w:t>Informatika</w:t>
-      </w:r>
-      <w:proofErr w:type="spellEnd"/>
     </w:p>
     <w:p>
       <w:pPr>
         <w:pStyle w:val="ReturnAddress"/>
-      </w:pPr>
-      <w:proofErr w:type="spellStart"/>
+        <w:rPr>
+          <w:lang w:val="sv-SE"/>
+        </w:rPr>
+      </w:pPr>
       <w:r>
+        <w:rPr>
+          <w:lang w:val="sv-SE"/>
+        </w:rPr>
         <w:t>Fakultas</w:t>
       </w:r>
-      <w:proofErr w:type="spellEnd"/>
       <w:r>
-        <w:t xml:space="preserve"> </w:t>
-      </w:r>
-      <w:proofErr w:type="spellStart"/>
-      <w:r>
-        <w:t>Teknologi</w:t>
-      </w:r>
-      <w:proofErr w:type="spellEnd"/>
-      <w:r>
-        <w:t xml:space="preserve"> Industri</w:t>
+        <w:rPr>
+          <w:lang w:val="sv-SE"/>
+        </w:rPr>
+        <w:t xml:space="preserve"> Teknologi Industri</w:t>
       </w:r>
       <w:r>
+        <w:rPr>
+          <w:lang w:val="sv-SE"/>
+        </w:rPr>
         <w:t xml:space="preserve"> </w:t>
       </w:r>
     </w:p>
     <w:p>
       <w:pPr>
         <w:pStyle w:val="ReturnAddress"/>
-      </w:pPr>
-      <w:proofErr w:type="spellStart"/>
+        <w:rPr>
+          <w:lang w:val="sv-SE"/>
+        </w:rPr>
+      </w:pPr>
       <w:r>
+        <w:rPr>
+          <w:lang w:val="sv-SE"/>
+        </w:rPr>
         <w:t>I</w:t>
       </w:r>
       <w:r>
-        <w:t>nstitut</w:t>
+        <w:rPr>
+          <w:lang w:val="sv-SE"/>
+        </w:rPr>
+        <w:t xml:space="preserve">nstitut </w:t>
       </w:r>
-      <w:proofErr w:type="spellEnd"/>
       <w:r>
-        <w:t xml:space="preserve"> </w:t>
-      </w:r>
-      <w:proofErr w:type="spellStart"/>
-      <w:r>
+        <w:rPr>
+          <w:lang w:val="sv-SE"/>
+        </w:rPr>
         <w:t>T</w:t>
       </w:r>
       <w:r>
-        <w:t>eknologi</w:t>
-      </w:r>
-      <w:proofErr w:type="spellEnd"/>
-      <w:r>
-        <w:t xml:space="preserve"> Sumatera</w:t>
+        <w:rPr>
+          <w:lang w:val="sv-SE"/>
+        </w:rPr>
+        <w:t>eknologi Sumatera</w:t>
       </w:r>
     </w:p>
     <w:p>
       <w:pPr>
         <w:pStyle w:val="ReturnAddress"/>
+        <w:rPr>
+          <w:lang w:val="sv-SE"/>
+        </w:rPr>
       </w:pPr>
     </w:p>
     <w:p>
       <w:pPr>
         <w:pStyle w:val="ReturnAddress"/>
+        <w:rPr>
+          <w:lang w:val="sv-SE"/>
+        </w:rPr>
       </w:pPr>
       <w:r>
+        <w:rPr>
+          <w:lang w:val="sv-SE"/>
+        </w:rPr>
         <w:t xml:space="preserve">Jl. </w:t>
       </w:r>
-      <w:proofErr w:type="spellStart"/>
       <w:r>
-        <w:t>Terusan</w:t>
-      </w:r>
-      <w:proofErr w:type="spellEnd"/>
-      <w:r>
-        <w:t xml:space="preserve"> Ryacudu, Desa Way Hui, </w:t>
-      </w:r>
-      <w:proofErr w:type="spellStart"/>
-      <w:r>
-        <w:t>Kecamatan</w:t>
-      </w:r>
-      <w:proofErr w:type="spellEnd"/>
-      <w:r>
-        <w:t xml:space="preserve"> Jati Agung, </w:t>
+        <w:rPr>
+          <w:lang w:val="sv-SE"/>
+        </w:rPr>
+        <w:t xml:space="preserve">Terusan Ryacudu, Desa Way Hui, Kecamatan Jati Agung, </w:t>
       </w:r>
     </w:p>
     <w:p>
       <w:pPr>
         <w:pStyle w:val="ReturnAddress"/>
+        <w:rPr>
+          <w:lang w:val="sv-SE"/>
+        </w:rPr>
       </w:pPr>
       <w:r>
-        <w:t>Lampung Selatan</w:t>
+        <w:rPr>
+          <w:lang w:val="sv-SE"/>
+        </w:rPr>
+        <w:t xml:space="preserve">Lampung Selatan </w:t>
       </w:r>
       <w:r>
+        <w:rPr>
+          <w:lang w:val="sv-SE"/>
+        </w:rPr>
+        <w:t xml:space="preserve">– </w:t>
+      </w:r>
+      <w:r>
+        <w:rPr>
+          <w:lang w:val="sv-SE"/>
+        </w:rPr>
+        <w:t>Lampung</w:t>
+      </w:r>
+      <w:r>
+        <w:rPr>
+          <w:lang w:val="sv-SE"/>
+        </w:rPr>
         <w:t xml:space="preserve"> </w:t>
       </w:r>
       <w:r>
-        <w:t xml:space="preserve">– </w:t>
-      </w:r>
-      <w:r>
-        <w:t>Lampung</w:t>
-      </w:r>
-      <w:r>
-        <w:t xml:space="preserve"> </w:t>
-      </w:r>
-      <w:r>
+        <w:rPr>
+          <w:lang w:val="sv-SE"/>
+        </w:rPr>
         <w:t>35365</w:t>
       </w:r>
     </w:p>
     <w:p>
       <w:pPr>
         <w:pStyle w:val="ReturnAddress"/>
+        <w:rPr>
+          <w:lang w:val="sv-SE"/>
+        </w:rPr>
       </w:pPr>
       <w:r>
+        <w:rPr>
+          <w:lang w:val="sv-SE"/>
+        </w:rPr>
         <w:t>Telp. +62-</w:t>
       </w:r>
       <w:r>
+        <w:rPr>
+          <w:lang w:val="sv-SE"/>
+        </w:rPr>
         <w:t>72</w:t>
       </w:r>
       <w:r>
-        <w:t>1-</w:t>
+        <w:rPr>
+          <w:lang w:val="sv-SE"/>
+        </w:rPr>
+        <w:t>1-8</w:t>
       </w:r>
       <w:r>
-        <w:t>8</w:t>
-      </w:r>
-      <w:r>
+        <w:rPr>
+          <w:lang w:val="sv-SE"/>
+        </w:rPr>
         <w:t>030188</w:t>
       </w:r>
       <w:r>
-        <w:t xml:space="preserve">; </w:t>
+        <w:rPr>
+          <w:lang w:val="sv-SE"/>
+        </w:rPr>
+        <w:t>; 8</w:t>
       </w:r>
       <w:r>
-        <w:t>8</w:t>
-      </w:r>
-      <w:r>
+        <w:rPr>
+          <w:lang w:val="sv-SE"/>
+        </w:rPr>
         <w:t>030189</w:t>
       </w:r>
     </w:p>
@@ -1784,7 +1246,9 @@
         </w:rPr>
       </w:pPr>
       <w:r>
-        <w:lastRenderedPageBreak/>
+        <w:rPr>
+          <w:lang w:val="sv-SE"/>
+        </w:rPr>
         <w:t xml:space="preserve"> </w:t>
       </w:r>
       <w:r>
@@ -1801,42 +1265,25 @@
           <w:b/>
           <w:bCs/>
           <w:sz w:val="30"/>
-        </w:rPr>
-      </w:pPr>
-      <w:proofErr w:type="spellStart"/>
+          <w:lang w:val="sv-SE"/>
+        </w:rPr>
+      </w:pPr>
       <w:r>
         <w:rPr>
           <w:b/>
           <w:bCs/>
           <w:sz w:val="30"/>
-        </w:rPr>
-        <w:t>Judul</w:t>
+          <w:lang w:val="sv-SE"/>
+        </w:rPr>
+        <w:t>Judul Praktikum</w:t>
       </w:r>
-      <w:proofErr w:type="spellEnd"/>
-      <w:r>
-        <w:rPr>
-          <w:b/>
-          <w:bCs/>
-          <w:sz w:val="30"/>
-        </w:rPr>
-        <w:t xml:space="preserve"> </w:t>
-      </w:r>
-      <w:proofErr w:type="spellStart"/>
-      <w:r>
-        <w:rPr>
-          <w:b/>
-          <w:bCs/>
-          <w:sz w:val="30"/>
-        </w:rPr>
-        <w:t>Praktikum</w:t>
-      </w:r>
-      <w:proofErr w:type="spellEnd"/>
     </w:p>
     <w:p>
       <w:pPr>
         <w:pStyle w:val="ReturnAddress"/>
         <w:rPr>
           <w:sz w:val="30"/>
+          <w:lang w:val="sv-SE"/>
         </w:rPr>
       </w:pPr>
     </w:p>
@@ -1867,22 +1314,17 @@
               <w:pStyle w:val="Heading2b"/>
               <w:rPr>
                 <w:bCs/>
+                <w:lang w:val="sv-SE"/>
               </w:rPr>
             </w:pPr>
             <w:r>
               <w:rPr>
                 <w:bCs/>
+                <w:lang w:val="sv-SE"/>
               </w:rPr>
-              <w:t xml:space="preserve">Rangkuman </w:t>
+              <w:lastRenderedPageBreak/>
+              <w:t>Rangkuman praktikum</w:t>
             </w:r>
-            <w:proofErr w:type="spellStart"/>
-            <w:r>
-              <w:rPr>
-                <w:bCs/>
-              </w:rPr>
-              <w:t>praktikum</w:t>
-            </w:r>
-            <w:proofErr w:type="spellEnd"/>
           </w:p>
           <w:p>
             <w:pPr>
@@ -1891,139 +1333,33 @@
                 <w:bCs/>
                 <w:sz w:val="20"/>
                 <w:szCs w:val="16"/>
+                <w:lang w:val="sv-SE"/>
               </w:rPr>
             </w:pPr>
-            <w:proofErr w:type="spellStart"/>
             <w:r>
               <w:rPr>
                 <w:bCs/>
                 <w:sz w:val="20"/>
                 <w:szCs w:val="16"/>
+                <w:lang w:val="sv-SE"/>
               </w:rPr>
-              <w:t>Poin-poin</w:t>
-            </w:r>
-            <w:proofErr w:type="spellEnd"/>
-            <w:r>
-              <w:rPr>
-                <w:bCs/>
-                <w:sz w:val="20"/>
-                <w:szCs w:val="16"/>
-              </w:rPr>
-              <w:t xml:space="preserve"> </w:t>
-            </w:r>
-            <w:proofErr w:type="spellStart"/>
-            <w:r>
-              <w:rPr>
-                <w:bCs/>
-                <w:sz w:val="20"/>
-                <w:szCs w:val="16"/>
-              </w:rPr>
-              <w:t>utama</w:t>
-            </w:r>
-            <w:proofErr w:type="spellEnd"/>
-            <w:r>
-              <w:rPr>
-                <w:bCs/>
-                <w:sz w:val="20"/>
-                <w:szCs w:val="16"/>
-              </w:rPr>
-              <w:t xml:space="preserve"> yang </w:t>
-            </w:r>
-            <w:proofErr w:type="spellStart"/>
-            <w:r>
-              <w:rPr>
-                <w:bCs/>
-                <w:sz w:val="20"/>
-                <w:szCs w:val="16"/>
-              </w:rPr>
-              <w:t>anda</w:t>
-            </w:r>
-            <w:proofErr w:type="spellEnd"/>
-            <w:r>
-              <w:rPr>
-                <w:bCs/>
-                <w:sz w:val="20"/>
-                <w:szCs w:val="16"/>
-              </w:rPr>
-              <w:t xml:space="preserve"> </w:t>
-            </w:r>
-            <w:proofErr w:type="spellStart"/>
-            <w:r>
-              <w:rPr>
-                <w:bCs/>
-                <w:sz w:val="20"/>
-                <w:szCs w:val="16"/>
-              </w:rPr>
-              <w:t>ketahui</w:t>
-            </w:r>
-            <w:proofErr w:type="spellEnd"/>
-            <w:r>
-              <w:rPr>
-                <w:bCs/>
-                <w:sz w:val="20"/>
-                <w:szCs w:val="16"/>
-              </w:rPr>
-              <w:t xml:space="preserve"> </w:t>
-            </w:r>
-            <w:proofErr w:type="spellStart"/>
-            <w:r>
-              <w:rPr>
-                <w:bCs/>
-                <w:sz w:val="20"/>
-                <w:szCs w:val="16"/>
-              </w:rPr>
-              <w:t>selama</w:t>
-            </w:r>
-            <w:proofErr w:type="spellEnd"/>
-            <w:r>
-              <w:rPr>
-                <w:bCs/>
-                <w:sz w:val="20"/>
-                <w:szCs w:val="16"/>
-              </w:rPr>
-              <w:t xml:space="preserve"> </w:t>
-            </w:r>
-            <w:proofErr w:type="spellStart"/>
-            <w:r>
-              <w:rPr>
-                <w:bCs/>
-                <w:sz w:val="20"/>
-                <w:szCs w:val="16"/>
-              </w:rPr>
-              <w:t>praktikum</w:t>
-            </w:r>
-            <w:proofErr w:type="spellEnd"/>
-            <w:r>
-              <w:rPr>
-                <w:bCs/>
-                <w:sz w:val="20"/>
-                <w:szCs w:val="16"/>
-              </w:rPr>
-              <w:t xml:space="preserve"> </w:t>
-            </w:r>
-            <w:proofErr w:type="spellStart"/>
-            <w:r>
-              <w:rPr>
-                <w:bCs/>
-                <w:sz w:val="20"/>
-                <w:szCs w:val="16"/>
-              </w:rPr>
-              <w:t>adalah</w:t>
-            </w:r>
-            <w:proofErr w:type="spellEnd"/>
-            <w:r>
-              <w:rPr>
-                <w:bCs/>
-                <w:sz w:val="20"/>
-                <w:szCs w:val="16"/>
-              </w:rPr>
-              <w:t>:</w:t>
+              <w:t>Poin-poin utama yang anda ketahui selama praktikum</w:t>
             </w:r>
             <w:r>
               <w:rPr>
                 <w:bCs/>
                 <w:sz w:val="20"/>
                 <w:szCs w:val="16"/>
+                <w:lang w:val="sv-SE"/>
+              </w:rPr>
+              <w:t xml:space="preserve"> adalah:</w:t>
+            </w:r>
+            <w:r>
+              <w:rPr>
+                <w:bCs/>
+                <w:sz w:val="20"/>
+                <w:szCs w:val="16"/>
+                <w:lang w:val="sv-SE"/>
               </w:rPr>
               <w:t xml:space="preserve"> </w:t>
             </w:r>
@@ -2192,7 +1528,6 @@
           <w:lang w:val="es-ES"/>
         </w:rPr>
       </w:pPr>
-      <w:proofErr w:type="spellStart"/>
       <w:r>
         <w:rPr>
           <w:b/>
@@ -2213,33 +1548,8 @@
           <w:szCs w:val="36"/>
           <w:lang w:val="es-ES"/>
         </w:rPr>
-        <w:t>okumentasi</w:t>
+        <w:t>okumentasi Praktikum</w:t>
       </w:r>
-      <w:proofErr w:type="spellEnd"/>
-      <w:r>
-        <w:rPr>
-          <w:b/>
-          <w:i w:val="0"/>
-          <w:spacing w:val="-5"/>
-          <w:sz w:val="40"/>
-          <w:szCs w:val="36"/>
-          <w:lang w:val="es-ES"/>
-        </w:rPr>
-        <w:t xml:space="preserve"> </w:t>
-      </w:r>
-      <w:proofErr w:type="spellStart"/>
-      <w:r>
-        <w:rPr>
-          <w:b/>
-          <w:i w:val="0"/>
-          <w:spacing w:val="-5"/>
-          <w:sz w:val="40"/>
-          <w:szCs w:val="36"/>
-          <w:lang w:val="es-ES"/>
-        </w:rPr>
-        <w:t>Praktikum</w:t>
-      </w:r>
-      <w:proofErr w:type="spellEnd"/>
     </w:p>
     <w:p>
       <w:pPr>
@@ -2253,9 +1563,9 @@
           <w:color w:val="000000"/>
           <w:sz w:val="24"/>
           <w:szCs w:val="24"/>
-        </w:rPr>
-      </w:pPr>
-      <w:proofErr w:type="spellStart"/>
+          <w:lang w:val="sv-SE"/>
+        </w:rPr>
+      </w:pPr>
       <w:r>
         <w:rPr>
           <w:b/>
@@ -2263,98 +1573,10 @@
           <w:color w:val="000000"/>
           <w:sz w:val="24"/>
           <w:szCs w:val="24"/>
-        </w:rPr>
-        <w:t>Jelaskan</w:t>
+          <w:lang w:val="sv-SE"/>
+        </w:rPr>
+        <w:t>Jelaskan Langkah-langkah yang dilakukan selama praktikum</w:t>
       </w:r>
-      <w:proofErr w:type="spellEnd"/>
-      <w:r>
-        <w:rPr>
-          <w:b/>
-          <w:bCs/>
-          <w:color w:val="000000"/>
-          <w:sz w:val="24"/>
-          <w:szCs w:val="24"/>
-        </w:rPr>
-        <w:t xml:space="preserve"> Langkah-</w:t>
-      </w:r>
-      <w:proofErr w:type="spellStart"/>
-      <w:r>
-        <w:rPr>
-          <w:b/>
-          <w:bCs/>
-          <w:color w:val="000000"/>
-          <w:sz w:val="24"/>
-          <w:szCs w:val="24"/>
-        </w:rPr>
-        <w:t>langkah</w:t>
-      </w:r>
-      <w:proofErr w:type="spellEnd"/>
-      <w:r>
-        <w:rPr>
-          <w:b/>
-          <w:bCs/>
-          <w:color w:val="000000"/>
-          <w:sz w:val="24"/>
-          <w:szCs w:val="24"/>
-        </w:rPr>
-        <w:t xml:space="preserve"> yang </w:t>
-      </w:r>
-      <w:proofErr w:type="spellStart"/>
-      <w:r>
-        <w:rPr>
-          <w:b/>
-          <w:bCs/>
-          <w:color w:val="000000"/>
-          <w:sz w:val="24"/>
-          <w:szCs w:val="24"/>
-        </w:rPr>
-        <w:t>dilakukan</w:t>
-      </w:r>
-      <w:proofErr w:type="spellEnd"/>
-      <w:r>
-        <w:rPr>
-          <w:b/>
-          <w:bCs/>
-          <w:color w:val="000000"/>
-          <w:sz w:val="24"/>
-          <w:szCs w:val="24"/>
-        </w:rPr>
-        <w:t xml:space="preserve"> </w:t>
-      </w:r>
-      <w:proofErr w:type="spellStart"/>
-      <w:r>
-        <w:rPr>
-          <w:b/>
-          <w:bCs/>
-          <w:color w:val="000000"/>
-          <w:sz w:val="24"/>
-          <w:szCs w:val="24"/>
-        </w:rPr>
-        <w:t>selama</w:t>
-      </w:r>
-      <w:proofErr w:type="spellEnd"/>
-      <w:r>
-        <w:rPr>
-          <w:b/>
-          <w:bCs/>
-          <w:color w:val="000000"/>
-          <w:sz w:val="24"/>
-          <w:szCs w:val="24"/>
-        </w:rPr>
-        <w:t xml:space="preserve"> </w:t>
-      </w:r>
-      <w:proofErr w:type="spellStart"/>
-      <w:r>
-        <w:rPr>
-          <w:b/>
-          <w:bCs/>
-          <w:color w:val="000000"/>
-          <w:sz w:val="24"/>
-          <w:szCs w:val="24"/>
-        </w:rPr>
-        <w:t>praktikum</w:t>
-      </w:r>
-      <w:proofErr w:type="spellEnd"/>
     </w:p>
     <w:p>
       <w:pPr>
@@ -2380,42 +1602,16 @@
           <w:color w:val="000000"/>
           <w:sz w:val="24"/>
           <w:szCs w:val="24"/>
-        </w:rPr>
-        <w:t xml:space="preserve">Langkah </w:t>
+          <w:lang w:val="sv-SE"/>
+        </w:rPr>
+        <w:t>Langkah pertama adalah</w:t>
       </w:r>
-      <w:proofErr w:type="spellStart"/>
       <w:r>
         <w:rPr>
           <w:color w:val="000000"/>
           <w:sz w:val="24"/>
           <w:szCs w:val="24"/>
-        </w:rPr>
-        <w:t>pertama</w:t>
-      </w:r>
-      <w:proofErr w:type="spellEnd"/>
-      <w:r>
-        <w:rPr>
-          <w:color w:val="000000"/>
-          <w:sz w:val="24"/>
-          <w:szCs w:val="24"/>
-        </w:rPr>
-        <w:t xml:space="preserve"> </w:t>
-      </w:r>
-      <w:proofErr w:type="spellStart"/>
-      <w:r>
-        <w:rPr>
-          <w:color w:val="000000"/>
-          <w:sz w:val="24"/>
-          <w:szCs w:val="24"/>
-        </w:rPr>
-        <w:t>adalah</w:t>
-      </w:r>
-      <w:proofErr w:type="spellEnd"/>
-      <w:r>
-        <w:rPr>
-          <w:color w:val="000000"/>
-          <w:sz w:val="24"/>
-          <w:szCs w:val="24"/>
+          <w:lang w:val="sv-SE"/>
         </w:rPr>
         <w:t xml:space="preserve"> </w:t>
       </w:r>
@@ -2426,19 +1622,24 @@
           <w:szCs w:val="24"/>
           <w:lang w:val="es-ES"/>
         </w:rPr>
-        <w:t>(</w:t>
+        <w:t>(silahkan jelaskan langkah-langkah selama praktikum)</w:t>
       </w:r>
-      <w:proofErr w:type="spellStart"/>
-      <w:r>
+    </w:p>
+    <w:p>
+      <w:pPr>
+        <w:pStyle w:val="ListParagraph"/>
+        <w:tabs>
+          <w:tab w:val="left" w:pos="709"/>
+        </w:tabs>
+        <w:spacing w:line="360" w:lineRule="auto"/>
+        <w:jc w:val="both"/>
         <w:rPr>
           <w:bCs/>
           <w:sz w:val="24"/>
           <w:szCs w:val="24"/>
           <w:lang w:val="es-ES"/>
         </w:rPr>
-        <w:t>silahkan</w:t>
-      </w:r>
-      <w:proofErr w:type="spellEnd"/>
+      </w:pPr>
       <w:r>
         <w:rPr>
           <w:bCs/>
@@ -2446,203 +1647,7 @@
           <w:szCs w:val="24"/>
           <w:lang w:val="es-ES"/>
         </w:rPr>
-        <w:t xml:space="preserve"> </w:t>
-      </w:r>
-      <w:proofErr w:type="spellStart"/>
-      <w:r>
-        <w:rPr>
-          <w:bCs/>
-          <w:sz w:val="24"/>
-          <w:szCs w:val="24"/>
-          <w:lang w:val="es-ES"/>
-        </w:rPr>
-        <w:t>jelaskan</w:t>
-      </w:r>
-      <w:proofErr w:type="spellEnd"/>
-      <w:r>
-        <w:rPr>
-          <w:bCs/>
-          <w:sz w:val="24"/>
-          <w:szCs w:val="24"/>
-          <w:lang w:val="es-ES"/>
-        </w:rPr>
-        <w:t xml:space="preserve"> </w:t>
-      </w:r>
-      <w:proofErr w:type="spellStart"/>
-      <w:r>
-        <w:rPr>
-          <w:bCs/>
-          <w:sz w:val="24"/>
-          <w:szCs w:val="24"/>
-          <w:lang w:val="es-ES"/>
-        </w:rPr>
-        <w:t>langkah-langkah</w:t>
-      </w:r>
-      <w:proofErr w:type="spellEnd"/>
-      <w:r>
-        <w:rPr>
-          <w:bCs/>
-          <w:sz w:val="24"/>
-          <w:szCs w:val="24"/>
-          <w:lang w:val="es-ES"/>
-        </w:rPr>
-        <w:t xml:space="preserve"> </w:t>
-      </w:r>
-      <w:proofErr w:type="spellStart"/>
-      <w:r>
-        <w:rPr>
-          <w:bCs/>
-          <w:sz w:val="24"/>
-          <w:szCs w:val="24"/>
-          <w:lang w:val="es-ES"/>
-        </w:rPr>
-        <w:t>selama</w:t>
-      </w:r>
-      <w:proofErr w:type="spellEnd"/>
-      <w:r>
-        <w:rPr>
-          <w:bCs/>
-          <w:sz w:val="24"/>
-          <w:szCs w:val="24"/>
-          <w:lang w:val="es-ES"/>
-        </w:rPr>
-        <w:t xml:space="preserve"> </w:t>
-      </w:r>
-      <w:proofErr w:type="spellStart"/>
-      <w:r>
-        <w:rPr>
-          <w:bCs/>
-          <w:sz w:val="24"/>
-          <w:szCs w:val="24"/>
-          <w:lang w:val="es-ES"/>
-        </w:rPr>
-        <w:t>praktikum</w:t>
-      </w:r>
-      <w:proofErr w:type="spellEnd"/>
-      <w:r>
-        <w:rPr>
-          <w:bCs/>
-          <w:sz w:val="24"/>
-          <w:szCs w:val="24"/>
-          <w:lang w:val="es-ES"/>
-        </w:rPr>
-        <w:t>)</w:t>
-      </w:r>
-    </w:p>
-    <w:p>
-      <w:pPr>
-        <w:pStyle w:val="ListParagraph"/>
-        <w:tabs>
-          <w:tab w:val="left" w:pos="709"/>
-        </w:tabs>
-        <w:spacing w:line="360" w:lineRule="auto"/>
-        <w:jc w:val="both"/>
-        <w:rPr>
-          <w:bCs/>
-          <w:sz w:val="24"/>
-          <w:szCs w:val="24"/>
-          <w:lang w:val="es-ES"/>
-        </w:rPr>
-      </w:pPr>
-      <w:proofErr w:type="spellStart"/>
-      <w:r>
-        <w:rPr>
-          <w:bCs/>
-          <w:sz w:val="24"/>
-          <w:szCs w:val="24"/>
-          <w:lang w:val="es-ES"/>
-        </w:rPr>
-        <w:t>Lampirkan</w:t>
-      </w:r>
-      <w:proofErr w:type="spellEnd"/>
-      <w:r>
-        <w:rPr>
-          <w:bCs/>
-          <w:sz w:val="24"/>
-          <w:szCs w:val="24"/>
-          <w:lang w:val="es-ES"/>
-        </w:rPr>
-        <w:t xml:space="preserve"> gambar yang </w:t>
-      </w:r>
-      <w:proofErr w:type="spellStart"/>
-      <w:r>
-        <w:rPr>
-          <w:bCs/>
-          <w:sz w:val="24"/>
-          <w:szCs w:val="24"/>
-          <w:lang w:val="es-ES"/>
-        </w:rPr>
-        <w:t>dilakukan</w:t>
-      </w:r>
-      <w:proofErr w:type="spellEnd"/>
-      <w:r>
-        <w:rPr>
-          <w:bCs/>
-          <w:sz w:val="24"/>
-          <w:szCs w:val="24"/>
-          <w:lang w:val="es-ES"/>
-        </w:rPr>
-        <w:t xml:space="preserve"> </w:t>
-      </w:r>
-      <w:proofErr w:type="spellStart"/>
-      <w:r>
-        <w:rPr>
-          <w:bCs/>
-          <w:sz w:val="24"/>
-          <w:szCs w:val="24"/>
-          <w:lang w:val="es-ES"/>
-        </w:rPr>
-        <w:t>selama</w:t>
-      </w:r>
-      <w:proofErr w:type="spellEnd"/>
-      <w:r>
-        <w:rPr>
-          <w:bCs/>
-          <w:sz w:val="24"/>
-          <w:szCs w:val="24"/>
-          <w:lang w:val="es-ES"/>
-        </w:rPr>
-        <w:t xml:space="preserve"> </w:t>
-      </w:r>
-      <w:proofErr w:type="spellStart"/>
-      <w:r>
-        <w:rPr>
-          <w:bCs/>
-          <w:sz w:val="24"/>
-          <w:szCs w:val="24"/>
-          <w:lang w:val="es-ES"/>
-        </w:rPr>
-        <w:t>langkah</w:t>
-      </w:r>
-      <w:proofErr w:type="spellEnd"/>
-      <w:r>
-        <w:rPr>
-          <w:bCs/>
-          <w:sz w:val="24"/>
-          <w:szCs w:val="24"/>
-          <w:lang w:val="es-ES"/>
-        </w:rPr>
-        <w:t xml:space="preserve"> </w:t>
-      </w:r>
-      <w:proofErr w:type="spellStart"/>
-      <w:r>
-        <w:rPr>
-          <w:bCs/>
-          <w:sz w:val="24"/>
-          <w:szCs w:val="24"/>
-          <w:lang w:val="es-ES"/>
-        </w:rPr>
-        <w:t>pertama</w:t>
-      </w:r>
-      <w:proofErr w:type="spellEnd"/>
-      <w:r>
-        <w:rPr>
-          <w:bCs/>
-          <w:sz w:val="24"/>
-          <w:szCs w:val="24"/>
-          <w:lang w:val="es-ES"/>
-        </w:rPr>
-        <w:t xml:space="preserve">. </w:t>
+        <w:t xml:space="preserve">Lampirkan gambar yang dilakukan selama langkah pertama. </w:t>
       </w:r>
     </w:p>
     <w:p>
@@ -2732,29 +1737,8 @@
         </w:r>
       </w:fldSimple>
       <w:r>
-        <w:t xml:space="preserve">. </w:t>
+        <w:t>. Ilustrasi dokumentasi praktikum</w:t>
       </w:r>
-      <w:proofErr w:type="spellStart"/>
-      <w:r>
-        <w:t>Ilustrasi</w:t>
-      </w:r>
-      <w:proofErr w:type="spellEnd"/>
-      <w:r>
-        <w:t xml:space="preserve"> </w:t>
-      </w:r>
-      <w:proofErr w:type="spellStart"/>
-      <w:r>
-        <w:t>dokumentasi</w:t>
-      </w:r>
-      <w:proofErr w:type="spellEnd"/>
-      <w:r>
-        <w:t xml:space="preserve"> </w:t>
-      </w:r>
-      <w:proofErr w:type="spellStart"/>
-      <w:r>
-        <w:t>praktikum</w:t>
-      </w:r>
-      <w:proofErr w:type="spellEnd"/>
     </w:p>
     <w:p/>
     <w:p/>
@@ -2787,7 +1771,6 @@
           <w:lang w:val="es-ES"/>
         </w:rPr>
       </w:pPr>
-      <w:proofErr w:type="spellStart"/>
       <w:r>
         <w:rPr>
           <w:bCs/>
@@ -2795,9 +1778,8 @@
           <w:szCs w:val="24"/>
           <w:lang w:val="es-ES"/>
         </w:rPr>
-        <w:t>Langkah</w:t>
+        <w:t>Langkah kedua adalah</w:t>
       </w:r>
-      <w:proofErr w:type="spellEnd"/>
       <w:r>
         <w:rPr>
           <w:bCs/>
@@ -2805,19 +1787,24 @@
           <w:szCs w:val="24"/>
           <w:lang w:val="es-ES"/>
         </w:rPr>
-        <w:t xml:space="preserve"> </w:t>
+        <w:t xml:space="preserve"> (silahkan jelaskan langkah-langkah selama praktikum)</w:t>
       </w:r>
-      <w:proofErr w:type="spellStart"/>
-      <w:r>
+    </w:p>
+    <w:p>
+      <w:pPr>
+        <w:pStyle w:val="ListParagraph"/>
+        <w:tabs>
+          <w:tab w:val="left" w:pos="709"/>
+        </w:tabs>
+        <w:spacing w:line="360" w:lineRule="auto"/>
+        <w:jc w:val="both"/>
         <w:rPr>
           <w:bCs/>
           <w:sz w:val="24"/>
           <w:szCs w:val="24"/>
           <w:lang w:val="es-ES"/>
         </w:rPr>
-        <w:t>kedua</w:t>
-      </w:r>
-      <w:proofErr w:type="spellEnd"/>
+      </w:pPr>
       <w:r>
         <w:rPr>
           <w:bCs/>
@@ -2825,9 +1812,9 @@
           <w:szCs w:val="24"/>
           <w:lang w:val="es-ES"/>
         </w:rPr>
-        <w:t xml:space="preserve"> </w:t>
+        <w:lastRenderedPageBreak/>
+        <w:t xml:space="preserve">Jika ada tabel </w:t>
       </w:r>
-      <w:proofErr w:type="spellStart"/>
       <w:r>
         <w:rPr>
           <w:bCs/>
@@ -2835,302 +1822,7 @@
           <w:szCs w:val="24"/>
           <w:lang w:val="es-ES"/>
         </w:rPr>
-        <w:t>adalah</w:t>
-      </w:r>
-      <w:proofErr w:type="spellEnd"/>
-      <w:r>
-        <w:rPr>
-          <w:bCs/>
-          <w:sz w:val="24"/>
-          <w:szCs w:val="24"/>
-          <w:lang w:val="es-ES"/>
-        </w:rPr>
-        <w:t xml:space="preserve"> (</w:t>
-      </w:r>
-      <w:proofErr w:type="spellStart"/>
-      <w:r>
-        <w:rPr>
-          <w:bCs/>
-          <w:sz w:val="24"/>
-          <w:szCs w:val="24"/>
-          <w:lang w:val="es-ES"/>
-        </w:rPr>
-        <w:t>silahkan</w:t>
-      </w:r>
-      <w:proofErr w:type="spellEnd"/>
-      <w:r>
-        <w:rPr>
-          <w:bCs/>
-          <w:sz w:val="24"/>
-          <w:szCs w:val="24"/>
-          <w:lang w:val="es-ES"/>
-        </w:rPr>
-        <w:t xml:space="preserve"> </w:t>
-      </w:r>
-      <w:proofErr w:type="spellStart"/>
-      <w:r>
-        <w:rPr>
-          <w:bCs/>
-          <w:sz w:val="24"/>
-          <w:szCs w:val="24"/>
-          <w:lang w:val="es-ES"/>
-        </w:rPr>
-        <w:t>jelaskan</w:t>
-      </w:r>
-      <w:proofErr w:type="spellEnd"/>
-      <w:r>
-        <w:rPr>
-          <w:bCs/>
-          <w:sz w:val="24"/>
-          <w:szCs w:val="24"/>
-          <w:lang w:val="es-ES"/>
-        </w:rPr>
-        <w:t xml:space="preserve"> </w:t>
-      </w:r>
-      <w:proofErr w:type="spellStart"/>
-      <w:r>
-        <w:rPr>
-          <w:bCs/>
-          <w:sz w:val="24"/>
-          <w:szCs w:val="24"/>
-          <w:lang w:val="es-ES"/>
-        </w:rPr>
-        <w:t>langkah-langkah</w:t>
-      </w:r>
-      <w:proofErr w:type="spellEnd"/>
-      <w:r>
-        <w:rPr>
-          <w:bCs/>
-          <w:sz w:val="24"/>
-          <w:szCs w:val="24"/>
-          <w:lang w:val="es-ES"/>
-        </w:rPr>
-        <w:t xml:space="preserve"> </w:t>
-      </w:r>
-      <w:proofErr w:type="spellStart"/>
-      <w:r>
-        <w:rPr>
-          <w:bCs/>
-          <w:sz w:val="24"/>
-          <w:szCs w:val="24"/>
-          <w:lang w:val="es-ES"/>
-        </w:rPr>
-        <w:t>selama</w:t>
-      </w:r>
-      <w:proofErr w:type="spellEnd"/>
-      <w:r>
-        <w:rPr>
-          <w:bCs/>
-          <w:sz w:val="24"/>
-          <w:szCs w:val="24"/>
-          <w:lang w:val="es-ES"/>
-        </w:rPr>
-        <w:t xml:space="preserve"> </w:t>
-      </w:r>
-      <w:proofErr w:type="spellStart"/>
-      <w:r>
-        <w:rPr>
-          <w:bCs/>
-          <w:sz w:val="24"/>
-          <w:szCs w:val="24"/>
-          <w:lang w:val="es-ES"/>
-        </w:rPr>
-        <w:t>praktikum</w:t>
-      </w:r>
-      <w:proofErr w:type="spellEnd"/>
-      <w:r>
-        <w:rPr>
-          <w:bCs/>
-          <w:sz w:val="24"/>
-          <w:szCs w:val="24"/>
-          <w:lang w:val="es-ES"/>
-        </w:rPr>
-        <w:t>)</w:t>
-      </w:r>
-    </w:p>
-    <w:p>
-      <w:pPr>
-        <w:pStyle w:val="ListParagraph"/>
-        <w:tabs>
-          <w:tab w:val="left" w:pos="709"/>
-        </w:tabs>
-        <w:spacing w:line="360" w:lineRule="auto"/>
-        <w:jc w:val="both"/>
-        <w:rPr>
-          <w:bCs/>
-          <w:sz w:val="24"/>
-          <w:szCs w:val="24"/>
-          <w:lang w:val="es-ES"/>
-        </w:rPr>
-      </w:pPr>
-      <w:proofErr w:type="spellStart"/>
-      <w:r>
-        <w:rPr>
-          <w:bCs/>
-          <w:sz w:val="24"/>
-          <w:szCs w:val="24"/>
-          <w:lang w:val="es-ES"/>
-        </w:rPr>
-        <w:t>Jika</w:t>
-      </w:r>
-      <w:proofErr w:type="spellEnd"/>
-      <w:r>
-        <w:rPr>
-          <w:bCs/>
-          <w:sz w:val="24"/>
-          <w:szCs w:val="24"/>
-          <w:lang w:val="es-ES"/>
-        </w:rPr>
-        <w:t xml:space="preserve"> </w:t>
-      </w:r>
-      <w:proofErr w:type="spellStart"/>
-      <w:r>
-        <w:rPr>
-          <w:bCs/>
-          <w:sz w:val="24"/>
-          <w:szCs w:val="24"/>
-          <w:lang w:val="es-ES"/>
-        </w:rPr>
-        <w:t>ada</w:t>
-      </w:r>
-      <w:proofErr w:type="spellEnd"/>
-      <w:r>
-        <w:rPr>
-          <w:bCs/>
-          <w:sz w:val="24"/>
-          <w:szCs w:val="24"/>
-          <w:lang w:val="es-ES"/>
-        </w:rPr>
-        <w:t xml:space="preserve"> </w:t>
-      </w:r>
-      <w:proofErr w:type="spellStart"/>
-      <w:r>
-        <w:rPr>
-          <w:bCs/>
-          <w:sz w:val="24"/>
-          <w:szCs w:val="24"/>
-          <w:lang w:val="es-ES"/>
-        </w:rPr>
-        <w:t>tabel</w:t>
-      </w:r>
-      <w:proofErr w:type="spellEnd"/>
-      <w:r>
-        <w:rPr>
-          <w:bCs/>
-          <w:sz w:val="24"/>
-          <w:szCs w:val="24"/>
-          <w:lang w:val="es-ES"/>
-        </w:rPr>
-        <w:t xml:space="preserve"> </w:t>
-      </w:r>
-      <w:r>
-        <w:rPr>
-          <w:bCs/>
-          <w:sz w:val="24"/>
-          <w:szCs w:val="24"/>
-          <w:lang w:val="es-ES"/>
-        </w:rPr>
-        <w:t xml:space="preserve">yang </w:t>
-      </w:r>
-      <w:proofErr w:type="spellStart"/>
-      <w:r>
-        <w:rPr>
-          <w:bCs/>
-          <w:sz w:val="24"/>
-          <w:szCs w:val="24"/>
-          <w:lang w:val="es-ES"/>
-        </w:rPr>
-        <w:t>perlu</w:t>
-      </w:r>
-      <w:proofErr w:type="spellEnd"/>
-      <w:r>
-        <w:rPr>
-          <w:bCs/>
-          <w:sz w:val="24"/>
-          <w:szCs w:val="24"/>
-          <w:lang w:val="es-ES"/>
-        </w:rPr>
-        <w:t xml:space="preserve"> </w:t>
-      </w:r>
-      <w:proofErr w:type="spellStart"/>
-      <w:r>
-        <w:rPr>
-          <w:bCs/>
-          <w:sz w:val="24"/>
-          <w:szCs w:val="24"/>
-          <w:lang w:val="es-ES"/>
-        </w:rPr>
-        <w:t>dilampirkan</w:t>
-      </w:r>
-      <w:proofErr w:type="spellEnd"/>
-      <w:r>
-        <w:rPr>
-          <w:bCs/>
-          <w:sz w:val="24"/>
-          <w:szCs w:val="24"/>
-          <w:lang w:val="es-ES"/>
-        </w:rPr>
-        <w:t xml:space="preserve"> </w:t>
-      </w:r>
-      <w:proofErr w:type="spellStart"/>
-      <w:r>
-        <w:rPr>
-          <w:bCs/>
-          <w:sz w:val="24"/>
-          <w:szCs w:val="24"/>
-          <w:lang w:val="es-ES"/>
-        </w:rPr>
-        <w:t>berikut</w:t>
-      </w:r>
-      <w:proofErr w:type="spellEnd"/>
-      <w:r>
-        <w:rPr>
-          <w:bCs/>
-          <w:sz w:val="24"/>
-          <w:szCs w:val="24"/>
-          <w:lang w:val="es-ES"/>
-        </w:rPr>
-        <w:t xml:space="preserve"> </w:t>
-      </w:r>
-      <w:proofErr w:type="spellStart"/>
-      <w:r>
-        <w:rPr>
-          <w:bCs/>
-          <w:sz w:val="24"/>
-          <w:szCs w:val="24"/>
-          <w:lang w:val="es-ES"/>
-        </w:rPr>
-        <w:t>format</w:t>
-      </w:r>
-      <w:proofErr w:type="spellEnd"/>
-      <w:r>
-        <w:rPr>
-          <w:bCs/>
-          <w:sz w:val="24"/>
-          <w:szCs w:val="24"/>
-          <w:lang w:val="es-ES"/>
-        </w:rPr>
-        <w:t xml:space="preserve"> table </w:t>
-      </w:r>
-      <w:proofErr w:type="spellStart"/>
-      <w:r>
-        <w:rPr>
-          <w:bCs/>
-          <w:sz w:val="24"/>
-          <w:szCs w:val="24"/>
-          <w:lang w:val="es-ES"/>
-        </w:rPr>
-        <w:t>nya</w:t>
-      </w:r>
-      <w:proofErr w:type="spellEnd"/>
-      <w:r>
-        <w:rPr>
-          <w:bCs/>
-          <w:sz w:val="24"/>
-          <w:szCs w:val="24"/>
-          <w:lang w:val="es-ES"/>
-        </w:rPr>
-        <w:t>.</w:t>
+        <w:t>yang perlu dilampirkan berikut format table nya.</w:t>
       </w:r>
     </w:p>
     <w:p>
@@ -3150,23 +1842,7 @@
         </w:r>
       </w:fldSimple>
       <w:r>
-        <w:t xml:space="preserve">. </w:t>
-      </w:r>
-      <w:proofErr w:type="spellStart"/>
-      <w:r>
-        <w:t>Contoh</w:t>
-      </w:r>
-      <w:proofErr w:type="spellEnd"/>
-      <w:r>
-        <w:t xml:space="preserve"> </w:t>
-      </w:r>
-      <w:proofErr w:type="spellStart"/>
-      <w:r>
-        <w:t>penggunaan</w:t>
-      </w:r>
-      <w:proofErr w:type="spellEnd"/>
-      <w:r>
-        <w:t xml:space="preserve"> table</w:t>
+        <w:t>. Contoh penggunaan table</w:t>
       </w:r>
     </w:p>
     <w:tbl>
@@ -3205,21 +1881,8 @@
             <w:pPr>
               <w:cnfStyle w:val="100000000000" w:firstRow="1" w:lastRow="0" w:firstColumn="0" w:lastColumn="0" w:oddVBand="0" w:evenVBand="0" w:oddHBand="0" w:evenHBand="0" w:firstRowFirstColumn="0" w:firstRowLastColumn="0" w:lastRowFirstColumn="0" w:lastRowLastColumn="0"/>
             </w:pPr>
-            <w:proofErr w:type="spellStart"/>
             <w:r>
-              <w:t>Judul</w:t>
-            </w:r>
-            <w:proofErr w:type="spellEnd"/>
-            <w:r>
-              <w:t xml:space="preserve"> </w:t>
-            </w:r>
-            <w:proofErr w:type="spellStart"/>
-            <w:r>
-              <w:t>kolom</w:t>
-            </w:r>
-            <w:proofErr w:type="spellEnd"/>
-            <w:r>
-              <w:t xml:space="preserve"> 1</w:t>
+              <w:t>Judul kolom 1</w:t>
             </w:r>
           </w:p>
         </w:tc>
@@ -3231,13 +1894,8 @@
             <w:pPr>
               <w:cnfStyle w:val="100000000000" w:firstRow="1" w:lastRow="0" w:firstColumn="0" w:lastColumn="0" w:oddVBand="0" w:evenVBand="0" w:oddHBand="0" w:evenHBand="0" w:firstRowFirstColumn="0" w:firstRowLastColumn="0" w:lastRowFirstColumn="0" w:lastRowLastColumn="0"/>
             </w:pPr>
-            <w:proofErr w:type="spellStart"/>
             <w:r>
-              <w:t>Judul</w:t>
-            </w:r>
-            <w:proofErr w:type="spellEnd"/>
-            <w:r>
-              <w:t xml:space="preserve"> Kolom 2</w:t>
+              <w:t>Judul Kolom 2</w:t>
             </w:r>
           </w:p>
         </w:tc>
@@ -3249,13 +1907,8 @@
             <w:pPr>
               <w:cnfStyle w:val="100000000000" w:firstRow="1" w:lastRow="0" w:firstColumn="0" w:lastColumn="0" w:oddVBand="0" w:evenVBand="0" w:oddHBand="0" w:evenHBand="0" w:firstRowFirstColumn="0" w:firstRowLastColumn="0" w:lastRowFirstColumn="0" w:lastRowLastColumn="0"/>
             </w:pPr>
-            <w:proofErr w:type="spellStart"/>
             <w:r>
-              <w:t>Judul</w:t>
-            </w:r>
-            <w:proofErr w:type="spellEnd"/>
-            <w:r>
-              <w:t xml:space="preserve"> Kolom 3</w:t>
+              <w:t>Judul Kolom 3</w:t>
             </w:r>
           </w:p>
         </w:tc>
@@ -3605,7 +2258,6 @@
           <w:lang w:val="es-ES"/>
         </w:rPr>
       </w:pPr>
-      <w:proofErr w:type="spellStart"/>
       <w:r>
         <w:rPr>
           <w:bCs/>
@@ -3613,9 +2265,8 @@
           <w:szCs w:val="24"/>
           <w:lang w:val="es-ES"/>
         </w:rPr>
-        <w:t>Langkah</w:t>
+        <w:t>Langkah ketiga adalah (silahkan jelaskan langkah-langkah selama praktikum)</w:t>
       </w:r>
-      <w:proofErr w:type="spellEnd"/>
       <w:r>
         <w:rPr>
           <w:bCs/>
@@ -3623,436 +2274,7 @@
           <w:szCs w:val="24"/>
           <w:lang w:val="es-ES"/>
         </w:rPr>
-        <w:t xml:space="preserve"> </w:t>
-      </w:r>
-      <w:proofErr w:type="spellStart"/>
-      <w:r>
-        <w:rPr>
-          <w:bCs/>
-          <w:sz w:val="24"/>
-          <w:szCs w:val="24"/>
-          <w:lang w:val="es-ES"/>
-        </w:rPr>
-        <w:t>ketiga</w:t>
-      </w:r>
-      <w:proofErr w:type="spellEnd"/>
-      <w:r>
-        <w:rPr>
-          <w:bCs/>
-          <w:sz w:val="24"/>
-          <w:szCs w:val="24"/>
-          <w:lang w:val="es-ES"/>
-        </w:rPr>
-        <w:t xml:space="preserve"> </w:t>
-      </w:r>
-      <w:proofErr w:type="spellStart"/>
-      <w:r>
-        <w:rPr>
-          <w:bCs/>
-          <w:sz w:val="24"/>
-          <w:szCs w:val="24"/>
-          <w:lang w:val="es-ES"/>
-        </w:rPr>
-        <w:t>adalah</w:t>
-      </w:r>
-      <w:proofErr w:type="spellEnd"/>
-      <w:r>
-        <w:rPr>
-          <w:bCs/>
-          <w:sz w:val="24"/>
-          <w:szCs w:val="24"/>
-          <w:lang w:val="es-ES"/>
-        </w:rPr>
-        <w:t xml:space="preserve"> (</w:t>
-      </w:r>
-      <w:proofErr w:type="spellStart"/>
-      <w:r>
-        <w:rPr>
-          <w:bCs/>
-          <w:sz w:val="24"/>
-          <w:szCs w:val="24"/>
-          <w:lang w:val="es-ES"/>
-        </w:rPr>
-        <w:t>silahkan</w:t>
-      </w:r>
-      <w:proofErr w:type="spellEnd"/>
-      <w:r>
-        <w:rPr>
-          <w:bCs/>
-          <w:sz w:val="24"/>
-          <w:szCs w:val="24"/>
-          <w:lang w:val="es-ES"/>
-        </w:rPr>
-        <w:t xml:space="preserve"> </w:t>
-      </w:r>
-      <w:proofErr w:type="spellStart"/>
-      <w:r>
-        <w:rPr>
-          <w:bCs/>
-          <w:sz w:val="24"/>
-          <w:szCs w:val="24"/>
-          <w:lang w:val="es-ES"/>
-        </w:rPr>
-        <w:t>jelaskan</w:t>
-      </w:r>
-      <w:proofErr w:type="spellEnd"/>
-      <w:r>
-        <w:rPr>
-          <w:bCs/>
-          <w:sz w:val="24"/>
-          <w:szCs w:val="24"/>
-          <w:lang w:val="es-ES"/>
-        </w:rPr>
-        <w:t xml:space="preserve"> </w:t>
-      </w:r>
-      <w:proofErr w:type="spellStart"/>
-      <w:r>
-        <w:rPr>
-          <w:bCs/>
-          <w:sz w:val="24"/>
-          <w:szCs w:val="24"/>
-          <w:lang w:val="es-ES"/>
-        </w:rPr>
-        <w:t>langkah-langkah</w:t>
-      </w:r>
-      <w:proofErr w:type="spellEnd"/>
-      <w:r>
-        <w:rPr>
-          <w:bCs/>
-          <w:sz w:val="24"/>
-          <w:szCs w:val="24"/>
-          <w:lang w:val="es-ES"/>
-        </w:rPr>
-        <w:t xml:space="preserve"> </w:t>
-      </w:r>
-      <w:proofErr w:type="spellStart"/>
-      <w:r>
-        <w:rPr>
-          <w:bCs/>
-          <w:sz w:val="24"/>
-          <w:szCs w:val="24"/>
-          <w:lang w:val="es-ES"/>
-        </w:rPr>
-        <w:t>selama</w:t>
-      </w:r>
-      <w:proofErr w:type="spellEnd"/>
-      <w:r>
-        <w:rPr>
-          <w:bCs/>
-          <w:sz w:val="24"/>
-          <w:szCs w:val="24"/>
-          <w:lang w:val="es-ES"/>
-        </w:rPr>
-        <w:t xml:space="preserve"> </w:t>
-      </w:r>
-      <w:proofErr w:type="spellStart"/>
-      <w:r>
-        <w:rPr>
-          <w:bCs/>
-          <w:sz w:val="24"/>
-          <w:szCs w:val="24"/>
-          <w:lang w:val="es-ES"/>
-        </w:rPr>
-        <w:t>praktikum</w:t>
-      </w:r>
-      <w:proofErr w:type="spellEnd"/>
-      <w:r>
-        <w:rPr>
-          <w:bCs/>
-          <w:sz w:val="24"/>
-          <w:szCs w:val="24"/>
-          <w:lang w:val="es-ES"/>
-        </w:rPr>
-        <w:t>)</w:t>
-      </w:r>
-      <w:r>
-        <w:rPr>
-          <w:bCs/>
-          <w:sz w:val="24"/>
-          <w:szCs w:val="24"/>
-          <w:lang w:val="es-ES"/>
-        </w:rPr>
-        <w:t xml:space="preserve">. </w:t>
-      </w:r>
-      <w:proofErr w:type="spellStart"/>
-      <w:r>
-        <w:rPr>
-          <w:bCs/>
-          <w:sz w:val="24"/>
-          <w:szCs w:val="24"/>
-          <w:lang w:val="es-ES"/>
-        </w:rPr>
-        <w:t>Jika</w:t>
-      </w:r>
-      <w:proofErr w:type="spellEnd"/>
-      <w:r>
-        <w:rPr>
-          <w:bCs/>
-          <w:sz w:val="24"/>
-          <w:szCs w:val="24"/>
-          <w:lang w:val="es-ES"/>
-        </w:rPr>
-        <w:t xml:space="preserve"> </w:t>
-      </w:r>
-      <w:proofErr w:type="spellStart"/>
-      <w:r>
-        <w:rPr>
-          <w:bCs/>
-          <w:sz w:val="24"/>
-          <w:szCs w:val="24"/>
-          <w:lang w:val="es-ES"/>
-        </w:rPr>
-        <w:t>ada</w:t>
-      </w:r>
-      <w:proofErr w:type="spellEnd"/>
-      <w:r>
-        <w:rPr>
-          <w:bCs/>
-          <w:sz w:val="24"/>
-          <w:szCs w:val="24"/>
-          <w:lang w:val="es-ES"/>
-        </w:rPr>
-        <w:t xml:space="preserve"> </w:t>
-      </w:r>
-      <w:proofErr w:type="spellStart"/>
-      <w:r>
-        <w:rPr>
-          <w:bCs/>
-          <w:sz w:val="24"/>
-          <w:szCs w:val="24"/>
-          <w:lang w:val="es-ES"/>
-        </w:rPr>
-        <w:t>penggunaan</w:t>
-      </w:r>
-      <w:proofErr w:type="spellEnd"/>
-      <w:r>
-        <w:rPr>
-          <w:bCs/>
-          <w:sz w:val="24"/>
-          <w:szCs w:val="24"/>
-          <w:lang w:val="es-ES"/>
-        </w:rPr>
-        <w:t xml:space="preserve"> </w:t>
-      </w:r>
-      <w:proofErr w:type="spellStart"/>
-      <w:r>
-        <w:rPr>
-          <w:bCs/>
-          <w:sz w:val="24"/>
-          <w:szCs w:val="24"/>
-          <w:lang w:val="es-ES"/>
-        </w:rPr>
-        <w:t>list</w:t>
-      </w:r>
-      <w:proofErr w:type="spellEnd"/>
-      <w:r>
-        <w:rPr>
-          <w:bCs/>
-          <w:sz w:val="24"/>
-          <w:szCs w:val="24"/>
-          <w:lang w:val="es-ES"/>
-        </w:rPr>
-        <w:t xml:space="preserve"> </w:t>
-      </w:r>
-      <w:proofErr w:type="spellStart"/>
-      <w:r>
-        <w:rPr>
-          <w:bCs/>
-          <w:sz w:val="24"/>
-          <w:szCs w:val="24"/>
-          <w:lang w:val="es-ES"/>
-        </w:rPr>
-        <w:t>atau</w:t>
-      </w:r>
-      <w:proofErr w:type="spellEnd"/>
-      <w:r>
-        <w:rPr>
-          <w:bCs/>
-          <w:sz w:val="24"/>
-          <w:szCs w:val="24"/>
-          <w:lang w:val="es-ES"/>
-        </w:rPr>
-        <w:t xml:space="preserve"> </w:t>
-      </w:r>
-      <w:proofErr w:type="spellStart"/>
-      <w:r>
-        <w:rPr>
-          <w:bCs/>
-          <w:sz w:val="24"/>
-          <w:szCs w:val="24"/>
-          <w:lang w:val="es-ES"/>
-        </w:rPr>
-        <w:t>item</w:t>
-      </w:r>
-      <w:proofErr w:type="spellEnd"/>
-      <w:r>
-        <w:rPr>
-          <w:bCs/>
-          <w:sz w:val="24"/>
-          <w:szCs w:val="24"/>
-          <w:lang w:val="es-ES"/>
-        </w:rPr>
-        <w:t xml:space="preserve"> di </w:t>
-      </w:r>
-      <w:proofErr w:type="spellStart"/>
-      <w:r>
-        <w:rPr>
-          <w:bCs/>
-          <w:sz w:val="24"/>
-          <w:szCs w:val="24"/>
-          <w:lang w:val="es-ES"/>
-        </w:rPr>
-        <w:t>dalam</w:t>
-      </w:r>
-      <w:proofErr w:type="spellEnd"/>
-      <w:r>
-        <w:rPr>
-          <w:bCs/>
-          <w:sz w:val="24"/>
-          <w:szCs w:val="24"/>
-          <w:lang w:val="es-ES"/>
-        </w:rPr>
-        <w:t xml:space="preserve"> </w:t>
-      </w:r>
-      <w:proofErr w:type="spellStart"/>
-      <w:r>
-        <w:rPr>
-          <w:bCs/>
-          <w:sz w:val="24"/>
-          <w:szCs w:val="24"/>
-          <w:lang w:val="es-ES"/>
-        </w:rPr>
-        <w:t>penjelasan</w:t>
-      </w:r>
-      <w:proofErr w:type="spellEnd"/>
-      <w:r>
-        <w:rPr>
-          <w:bCs/>
-          <w:sz w:val="24"/>
-          <w:szCs w:val="24"/>
-          <w:lang w:val="es-ES"/>
-        </w:rPr>
-        <w:t xml:space="preserve"> anda, </w:t>
-      </w:r>
-      <w:proofErr w:type="spellStart"/>
-      <w:r>
-        <w:rPr>
-          <w:bCs/>
-          <w:sz w:val="24"/>
-          <w:szCs w:val="24"/>
-          <w:lang w:val="es-ES"/>
-        </w:rPr>
-        <w:t>silahkan</w:t>
-      </w:r>
-      <w:proofErr w:type="spellEnd"/>
-      <w:r>
-        <w:rPr>
-          <w:bCs/>
-          <w:sz w:val="24"/>
-          <w:szCs w:val="24"/>
-          <w:lang w:val="es-ES"/>
-        </w:rPr>
-        <w:t xml:space="preserve"> </w:t>
-      </w:r>
-      <w:proofErr w:type="spellStart"/>
-      <w:r>
-        <w:rPr>
-          <w:bCs/>
-          <w:sz w:val="24"/>
-          <w:szCs w:val="24"/>
-          <w:lang w:val="es-ES"/>
-        </w:rPr>
-        <w:t>gunakan</w:t>
-      </w:r>
-      <w:proofErr w:type="spellEnd"/>
-      <w:r>
-        <w:rPr>
-          <w:bCs/>
-          <w:sz w:val="24"/>
-          <w:szCs w:val="24"/>
-          <w:lang w:val="es-ES"/>
-        </w:rPr>
-        <w:t xml:space="preserve"> </w:t>
-      </w:r>
-      <w:proofErr w:type="spellStart"/>
-      <w:r>
-        <w:rPr>
-          <w:bCs/>
-          <w:sz w:val="24"/>
-          <w:szCs w:val="24"/>
-          <w:lang w:val="es-ES"/>
-        </w:rPr>
-        <w:t>format</w:t>
-      </w:r>
-      <w:proofErr w:type="spellEnd"/>
-      <w:r>
-        <w:rPr>
-          <w:bCs/>
-          <w:sz w:val="24"/>
-          <w:szCs w:val="24"/>
-          <w:lang w:val="es-ES"/>
-        </w:rPr>
-        <w:t xml:space="preserve"> </w:t>
-      </w:r>
-      <w:proofErr w:type="spellStart"/>
-      <w:r>
-        <w:rPr>
-          <w:bCs/>
-          <w:sz w:val="24"/>
-          <w:szCs w:val="24"/>
-          <w:lang w:val="es-ES"/>
-        </w:rPr>
-        <w:t>bullet</w:t>
-      </w:r>
-      <w:proofErr w:type="spellEnd"/>
-      <w:r>
-        <w:rPr>
-          <w:bCs/>
-          <w:sz w:val="24"/>
-          <w:szCs w:val="24"/>
-          <w:lang w:val="es-ES"/>
-        </w:rPr>
-        <w:t xml:space="preserve"> and </w:t>
-      </w:r>
-      <w:proofErr w:type="spellStart"/>
-      <w:r>
-        <w:rPr>
-          <w:bCs/>
-          <w:sz w:val="24"/>
-          <w:szCs w:val="24"/>
-          <w:lang w:val="es-ES"/>
-        </w:rPr>
-        <w:t>numbering</w:t>
-      </w:r>
-      <w:proofErr w:type="spellEnd"/>
-      <w:r>
-        <w:rPr>
-          <w:bCs/>
-          <w:sz w:val="24"/>
-          <w:szCs w:val="24"/>
-          <w:lang w:val="es-ES"/>
-        </w:rPr>
-        <w:t xml:space="preserve"> </w:t>
-      </w:r>
-      <w:proofErr w:type="spellStart"/>
-      <w:r>
-        <w:rPr>
-          <w:bCs/>
-          <w:sz w:val="24"/>
-          <w:szCs w:val="24"/>
-          <w:lang w:val="es-ES"/>
-        </w:rPr>
-        <w:t>berikut</w:t>
-      </w:r>
-      <w:proofErr w:type="spellEnd"/>
-      <w:r>
-        <w:rPr>
-          <w:bCs/>
-          <w:sz w:val="24"/>
-          <w:szCs w:val="24"/>
-          <w:lang w:val="es-ES"/>
-        </w:rPr>
-        <w:t>:</w:t>
+        <w:t>. Jika ada penggunaan list atau item di dalam penjelasan anda, silahkan gunakan format bullet and numbering berikut:</w:t>
       </w:r>
     </w:p>
     <w:p>
@@ -4189,340 +2411,22 @@
           <w:lang w:val="es-ES"/>
         </w:rPr>
       </w:pPr>
-      <w:proofErr w:type="spellStart"/>
       <w:r>
         <w:rPr>
           <w:sz w:val="24"/>
           <w:szCs w:val="24"/>
           <w:lang w:val="es-ES"/>
         </w:rPr>
-        <w:t>Jelaskan</w:t>
+        <w:t xml:space="preserve">Jelaskan alat dan bahan yang digunakan dalam praktikum. </w:t>
       </w:r>
-      <w:proofErr w:type="spellEnd"/>
       <w:r>
         <w:rPr>
           <w:sz w:val="24"/>
           <w:szCs w:val="24"/>
           <w:lang w:val="es-ES"/>
         </w:rPr>
-        <w:t xml:space="preserve"> </w:t>
+        <w:t>Deskripsikan alat atau device yang anda gunakan. Jika menggunakan komputer Windows, cukup dengan memberikan screenshoot dxdiag</w:t>
       </w:r>
-      <w:proofErr w:type="spellStart"/>
-      <w:r>
-        <w:rPr>
-          <w:sz w:val="24"/>
-          <w:szCs w:val="24"/>
-          <w:lang w:val="es-ES"/>
-        </w:rPr>
-        <w:t>alat</w:t>
-      </w:r>
-      <w:proofErr w:type="spellEnd"/>
-      <w:r>
-        <w:rPr>
-          <w:sz w:val="24"/>
-          <w:szCs w:val="24"/>
-          <w:lang w:val="es-ES"/>
-        </w:rPr>
-        <w:t xml:space="preserve"> dan </w:t>
-      </w:r>
-      <w:proofErr w:type="spellStart"/>
-      <w:r>
-        <w:rPr>
-          <w:sz w:val="24"/>
-          <w:szCs w:val="24"/>
-          <w:lang w:val="es-ES"/>
-        </w:rPr>
-        <w:t>bahan</w:t>
-      </w:r>
-      <w:proofErr w:type="spellEnd"/>
-      <w:r>
-        <w:rPr>
-          <w:sz w:val="24"/>
-          <w:szCs w:val="24"/>
-          <w:lang w:val="es-ES"/>
-        </w:rPr>
-        <w:t xml:space="preserve"> yang </w:t>
-      </w:r>
-      <w:proofErr w:type="spellStart"/>
-      <w:r>
-        <w:rPr>
-          <w:sz w:val="24"/>
-          <w:szCs w:val="24"/>
-          <w:lang w:val="es-ES"/>
-        </w:rPr>
-        <w:t>digunakan</w:t>
-      </w:r>
-      <w:proofErr w:type="spellEnd"/>
-      <w:r>
-        <w:rPr>
-          <w:sz w:val="24"/>
-          <w:szCs w:val="24"/>
-          <w:lang w:val="es-ES"/>
-        </w:rPr>
-        <w:t xml:space="preserve"> </w:t>
-      </w:r>
-      <w:proofErr w:type="spellStart"/>
-      <w:r>
-        <w:rPr>
-          <w:sz w:val="24"/>
-          <w:szCs w:val="24"/>
-          <w:lang w:val="es-ES"/>
-        </w:rPr>
-        <w:t>dalam</w:t>
-      </w:r>
-      <w:proofErr w:type="spellEnd"/>
-      <w:r>
-        <w:rPr>
-          <w:sz w:val="24"/>
-          <w:szCs w:val="24"/>
-          <w:lang w:val="es-ES"/>
-        </w:rPr>
-        <w:t xml:space="preserve"> </w:t>
-      </w:r>
-      <w:proofErr w:type="spellStart"/>
-      <w:r>
-        <w:rPr>
-          <w:sz w:val="24"/>
-          <w:szCs w:val="24"/>
-          <w:lang w:val="es-ES"/>
-        </w:rPr>
-        <w:t>praktikum</w:t>
-      </w:r>
-      <w:proofErr w:type="spellEnd"/>
-      <w:r>
-        <w:rPr>
-          <w:sz w:val="24"/>
-          <w:szCs w:val="24"/>
-          <w:lang w:val="es-ES"/>
-        </w:rPr>
-        <w:t xml:space="preserve">. </w:t>
-      </w:r>
-      <w:proofErr w:type="spellStart"/>
-      <w:r>
-        <w:rPr>
-          <w:sz w:val="24"/>
-          <w:szCs w:val="24"/>
-          <w:lang w:val="es-ES"/>
-        </w:rPr>
-        <w:t>Deskripsikan</w:t>
-      </w:r>
-      <w:proofErr w:type="spellEnd"/>
-      <w:r>
-        <w:rPr>
-          <w:sz w:val="24"/>
-          <w:szCs w:val="24"/>
-          <w:lang w:val="es-ES"/>
-        </w:rPr>
-        <w:t xml:space="preserve"> </w:t>
-      </w:r>
-      <w:proofErr w:type="spellStart"/>
-      <w:r>
-        <w:rPr>
-          <w:sz w:val="24"/>
-          <w:szCs w:val="24"/>
-          <w:lang w:val="es-ES"/>
-        </w:rPr>
-        <w:t>alat</w:t>
-      </w:r>
-      <w:proofErr w:type="spellEnd"/>
-      <w:r>
-        <w:rPr>
-          <w:sz w:val="24"/>
-          <w:szCs w:val="24"/>
-          <w:lang w:val="es-ES"/>
-        </w:rPr>
-        <w:t xml:space="preserve"> </w:t>
-      </w:r>
-      <w:proofErr w:type="spellStart"/>
-      <w:r>
-        <w:rPr>
-          <w:sz w:val="24"/>
-          <w:szCs w:val="24"/>
-          <w:lang w:val="es-ES"/>
-        </w:rPr>
-        <w:t>atau</w:t>
-      </w:r>
-      <w:proofErr w:type="spellEnd"/>
-      <w:r>
-        <w:rPr>
-          <w:sz w:val="24"/>
-          <w:szCs w:val="24"/>
-          <w:lang w:val="es-ES"/>
-        </w:rPr>
-        <w:t xml:space="preserve"> </w:t>
-      </w:r>
-      <w:proofErr w:type="spellStart"/>
-      <w:r>
-        <w:rPr>
-          <w:sz w:val="24"/>
-          <w:szCs w:val="24"/>
-          <w:lang w:val="es-ES"/>
-        </w:rPr>
-        <w:t>device</w:t>
-      </w:r>
-      <w:proofErr w:type="spellEnd"/>
-      <w:r>
-        <w:rPr>
-          <w:sz w:val="24"/>
-          <w:szCs w:val="24"/>
-          <w:lang w:val="es-ES"/>
-        </w:rPr>
-        <w:t xml:space="preserve"> yang anda </w:t>
-      </w:r>
-      <w:proofErr w:type="spellStart"/>
-      <w:r>
-        <w:rPr>
-          <w:sz w:val="24"/>
-          <w:szCs w:val="24"/>
-          <w:lang w:val="es-ES"/>
-        </w:rPr>
-        <w:t>gunakan</w:t>
-      </w:r>
-      <w:proofErr w:type="spellEnd"/>
-      <w:r>
-        <w:rPr>
-          <w:sz w:val="24"/>
-          <w:szCs w:val="24"/>
-          <w:lang w:val="es-ES"/>
-        </w:rPr>
-        <w:t xml:space="preserve">. </w:t>
-      </w:r>
-      <w:proofErr w:type="spellStart"/>
-      <w:r>
-        <w:rPr>
-          <w:sz w:val="24"/>
-          <w:szCs w:val="24"/>
-          <w:lang w:val="es-ES"/>
-        </w:rPr>
-        <w:t>Jika</w:t>
-      </w:r>
-      <w:proofErr w:type="spellEnd"/>
-      <w:r>
-        <w:rPr>
-          <w:sz w:val="24"/>
-          <w:szCs w:val="24"/>
-          <w:lang w:val="es-ES"/>
-        </w:rPr>
-        <w:t xml:space="preserve"> </w:t>
-      </w:r>
-      <w:proofErr w:type="spellStart"/>
-      <w:r>
-        <w:rPr>
-          <w:sz w:val="24"/>
-          <w:szCs w:val="24"/>
-          <w:lang w:val="es-ES"/>
-        </w:rPr>
-        <w:t>menggunakan</w:t>
-      </w:r>
-      <w:proofErr w:type="spellEnd"/>
-      <w:r>
-        <w:rPr>
-          <w:sz w:val="24"/>
-          <w:szCs w:val="24"/>
-          <w:lang w:val="es-ES"/>
-        </w:rPr>
-        <w:t xml:space="preserve"> </w:t>
-      </w:r>
-      <w:proofErr w:type="spellStart"/>
-      <w:r>
-        <w:rPr>
-          <w:sz w:val="24"/>
-          <w:szCs w:val="24"/>
-          <w:lang w:val="es-ES"/>
-        </w:rPr>
-        <w:t>komputer</w:t>
-      </w:r>
-      <w:proofErr w:type="spellEnd"/>
-      <w:r>
-        <w:rPr>
-          <w:sz w:val="24"/>
-          <w:szCs w:val="24"/>
-          <w:lang w:val="es-ES"/>
-        </w:rPr>
-        <w:t xml:space="preserve"> Windows, </w:t>
-      </w:r>
-      <w:proofErr w:type="spellStart"/>
-      <w:r>
-        <w:rPr>
-          <w:sz w:val="24"/>
-          <w:szCs w:val="24"/>
-          <w:lang w:val="es-ES"/>
-        </w:rPr>
-        <w:t>cukup</w:t>
-      </w:r>
-      <w:proofErr w:type="spellEnd"/>
-      <w:r>
-        <w:rPr>
-          <w:sz w:val="24"/>
-          <w:szCs w:val="24"/>
-          <w:lang w:val="es-ES"/>
-        </w:rPr>
-        <w:t xml:space="preserve"> </w:t>
-      </w:r>
-      <w:proofErr w:type="spellStart"/>
-      <w:r>
-        <w:rPr>
-          <w:sz w:val="24"/>
-          <w:szCs w:val="24"/>
-          <w:lang w:val="es-ES"/>
-        </w:rPr>
-        <w:t>dengan</w:t>
-      </w:r>
-      <w:proofErr w:type="spellEnd"/>
-      <w:r>
-        <w:rPr>
-          <w:sz w:val="24"/>
-          <w:szCs w:val="24"/>
-          <w:lang w:val="es-ES"/>
-        </w:rPr>
-        <w:t xml:space="preserve"> </w:t>
-      </w:r>
-      <w:proofErr w:type="spellStart"/>
-      <w:r>
-        <w:rPr>
-          <w:sz w:val="24"/>
-          <w:szCs w:val="24"/>
-          <w:lang w:val="es-ES"/>
-        </w:rPr>
-        <w:t>memberikan</w:t>
-      </w:r>
-      <w:proofErr w:type="spellEnd"/>
-      <w:r>
-        <w:rPr>
-          <w:sz w:val="24"/>
-          <w:szCs w:val="24"/>
-          <w:lang w:val="es-ES"/>
-        </w:rPr>
-        <w:t xml:space="preserve"> </w:t>
-      </w:r>
-      <w:proofErr w:type="spellStart"/>
-      <w:r>
-        <w:rPr>
-          <w:sz w:val="24"/>
-          <w:szCs w:val="24"/>
-          <w:lang w:val="es-ES"/>
-        </w:rPr>
-        <w:t>screenshoot</w:t>
-      </w:r>
-      <w:proofErr w:type="spellEnd"/>
-      <w:r>
-        <w:rPr>
-          <w:sz w:val="24"/>
-          <w:szCs w:val="24"/>
-          <w:lang w:val="es-ES"/>
-        </w:rPr>
-        <w:t xml:space="preserve"> </w:t>
-      </w:r>
-      <w:proofErr w:type="spellStart"/>
-      <w:r>
-        <w:rPr>
-          <w:sz w:val="24"/>
-          <w:szCs w:val="24"/>
-          <w:lang w:val="es-ES"/>
-        </w:rPr>
-        <w:t>dxdiag</w:t>
-      </w:r>
-      <w:proofErr w:type="spellEnd"/>
       <w:r>
         <w:rPr>
           <w:sz w:val="24"/>
@@ -4544,6 +2448,7 @@
           <w:color w:val="000000"/>
           <w:sz w:val="24"/>
           <w:szCs w:val="24"/>
+          <w:lang w:val="es-ES"/>
         </w:rPr>
       </w:pPr>
     </w:p>
@@ -4558,18 +2463,18 @@
           <w:color w:val="000000"/>
           <w:sz w:val="24"/>
           <w:szCs w:val="24"/>
-        </w:rPr>
-      </w:pPr>
-      <w:proofErr w:type="spellStart"/>
+          <w:lang w:val="es-ES"/>
+        </w:rPr>
+      </w:pPr>
       <w:r>
         <w:rPr>
           <w:b/>
           <w:sz w:val="40"/>
           <w:szCs w:val="36"/>
+          <w:lang w:val="es-ES"/>
         </w:rPr>
         <w:t>Tugas</w:t>
       </w:r>
-      <w:proofErr w:type="spellEnd"/>
     </w:p>
     <w:p>
       <w:pPr>
@@ -4584,347 +2489,23 @@
           <w:lang w:val="es-ES"/>
         </w:rPr>
       </w:pPr>
-      <w:proofErr w:type="spellStart"/>
       <w:r>
         <w:rPr>
           <w:color w:val="000000"/>
           <w:sz w:val="24"/>
           <w:szCs w:val="24"/>
-        </w:rPr>
-        <w:t>Silahkan</w:t>
+          <w:lang w:val="es-ES"/>
+        </w:rPr>
+        <w:t xml:space="preserve">Silahkan jelaskan jawaban dari tugas yang diberikan. </w:t>
       </w:r>
-      <w:proofErr w:type="spellEnd"/>
       <w:r>
         <w:rPr>
           <w:color w:val="000000"/>
           <w:sz w:val="24"/>
           <w:szCs w:val="24"/>
-        </w:rPr>
-        <w:t xml:space="preserve"> </w:t>
-      </w:r>
-      <w:proofErr w:type="spellStart"/>
-      <w:r>
-        <w:rPr>
-          <w:color w:val="000000"/>
-          <w:sz w:val="24"/>
-          <w:szCs w:val="24"/>
-        </w:rPr>
-        <w:t>jelaskan</w:t>
-      </w:r>
-      <w:proofErr w:type="spellEnd"/>
-      <w:r>
-        <w:rPr>
-          <w:color w:val="000000"/>
-          <w:sz w:val="24"/>
-          <w:szCs w:val="24"/>
-        </w:rPr>
-        <w:t xml:space="preserve"> </w:t>
-      </w:r>
-      <w:proofErr w:type="spellStart"/>
-      <w:r>
-        <w:rPr>
-          <w:color w:val="000000"/>
-          <w:sz w:val="24"/>
-          <w:szCs w:val="24"/>
-        </w:rPr>
-        <w:t>jawaban</w:t>
-      </w:r>
-      <w:proofErr w:type="spellEnd"/>
-      <w:r>
-        <w:rPr>
-          <w:color w:val="000000"/>
-          <w:sz w:val="24"/>
-          <w:szCs w:val="24"/>
-        </w:rPr>
-        <w:t xml:space="preserve"> </w:t>
-      </w:r>
-      <w:proofErr w:type="spellStart"/>
-      <w:r>
-        <w:rPr>
-          <w:color w:val="000000"/>
-          <w:sz w:val="24"/>
-          <w:szCs w:val="24"/>
-        </w:rPr>
-        <w:t>dari</w:t>
-      </w:r>
-      <w:proofErr w:type="spellEnd"/>
-      <w:r>
-        <w:rPr>
-          <w:color w:val="000000"/>
-          <w:sz w:val="24"/>
-          <w:szCs w:val="24"/>
-        </w:rPr>
-        <w:t xml:space="preserve"> </w:t>
-      </w:r>
-      <w:proofErr w:type="spellStart"/>
-      <w:r>
-        <w:rPr>
-          <w:color w:val="000000"/>
-          <w:sz w:val="24"/>
-          <w:szCs w:val="24"/>
-        </w:rPr>
-        <w:t>tugas</w:t>
-      </w:r>
-      <w:proofErr w:type="spellEnd"/>
-      <w:r>
-        <w:rPr>
-          <w:color w:val="000000"/>
-          <w:sz w:val="24"/>
-          <w:szCs w:val="24"/>
-        </w:rPr>
-        <w:t xml:space="preserve"> yang </w:t>
-      </w:r>
-      <w:proofErr w:type="spellStart"/>
-      <w:r>
-        <w:rPr>
-          <w:color w:val="000000"/>
-          <w:sz w:val="24"/>
-          <w:szCs w:val="24"/>
-        </w:rPr>
-        <w:t>diberikan</w:t>
-      </w:r>
-      <w:proofErr w:type="spellEnd"/>
-      <w:r>
-        <w:rPr>
-          <w:color w:val="000000"/>
-          <w:sz w:val="24"/>
-          <w:szCs w:val="24"/>
-        </w:rPr>
-        <w:t xml:space="preserve">. Jika </w:t>
-      </w:r>
-      <w:proofErr w:type="spellStart"/>
-      <w:r>
-        <w:rPr>
-          <w:color w:val="000000"/>
-          <w:sz w:val="24"/>
-          <w:szCs w:val="24"/>
-        </w:rPr>
-        <w:t>tidak</w:t>
-      </w:r>
-      <w:proofErr w:type="spellEnd"/>
-      <w:r>
-        <w:rPr>
-          <w:color w:val="000000"/>
-          <w:sz w:val="24"/>
-          <w:szCs w:val="24"/>
-        </w:rPr>
-        <w:t xml:space="preserve"> </w:t>
-      </w:r>
-      <w:proofErr w:type="spellStart"/>
-      <w:r>
-        <w:rPr>
-          <w:color w:val="000000"/>
-          <w:sz w:val="24"/>
-          <w:szCs w:val="24"/>
-        </w:rPr>
-        <w:t>ada</w:t>
-      </w:r>
-      <w:proofErr w:type="spellEnd"/>
-      <w:r>
-        <w:rPr>
-          <w:color w:val="000000"/>
-          <w:sz w:val="24"/>
-          <w:szCs w:val="24"/>
-        </w:rPr>
-        <w:t xml:space="preserve"> </w:t>
-      </w:r>
-      <w:proofErr w:type="spellStart"/>
-      <w:r>
-        <w:rPr>
-          <w:color w:val="000000"/>
-          <w:sz w:val="24"/>
-          <w:szCs w:val="24"/>
-        </w:rPr>
-        <w:t>tugas</w:t>
-      </w:r>
-      <w:proofErr w:type="spellEnd"/>
-      <w:r>
-        <w:rPr>
-          <w:color w:val="000000"/>
-          <w:sz w:val="24"/>
-          <w:szCs w:val="24"/>
-        </w:rPr>
-        <w:t xml:space="preserve">, </w:t>
-      </w:r>
-      <w:proofErr w:type="spellStart"/>
-      <w:r>
-        <w:rPr>
-          <w:color w:val="000000"/>
-          <w:sz w:val="24"/>
-          <w:szCs w:val="24"/>
-        </w:rPr>
-        <w:t>maka</w:t>
-      </w:r>
-      <w:proofErr w:type="spellEnd"/>
-      <w:r>
-        <w:rPr>
-          <w:color w:val="000000"/>
-          <w:sz w:val="24"/>
-          <w:szCs w:val="24"/>
-        </w:rPr>
-        <w:t xml:space="preserve"> </w:t>
-      </w:r>
-      <w:proofErr w:type="spellStart"/>
-      <w:r>
-        <w:rPr>
-          <w:color w:val="000000"/>
-          <w:sz w:val="24"/>
-          <w:szCs w:val="24"/>
-        </w:rPr>
-        <w:t>setiap</w:t>
-      </w:r>
-      <w:proofErr w:type="spellEnd"/>
-      <w:r>
-        <w:rPr>
-          <w:color w:val="000000"/>
-          <w:sz w:val="24"/>
-          <w:szCs w:val="24"/>
-        </w:rPr>
-        <w:t xml:space="preserve"> </w:t>
-      </w:r>
-      <w:proofErr w:type="spellStart"/>
-      <w:r>
-        <w:rPr>
-          <w:color w:val="000000"/>
-          <w:sz w:val="24"/>
-          <w:szCs w:val="24"/>
-        </w:rPr>
-        <w:t>praktikum</w:t>
-      </w:r>
-      <w:proofErr w:type="spellEnd"/>
-      <w:r>
-        <w:rPr>
-          <w:color w:val="000000"/>
-          <w:sz w:val="24"/>
-          <w:szCs w:val="24"/>
-        </w:rPr>
-        <w:t xml:space="preserve"> </w:t>
-      </w:r>
-      <w:proofErr w:type="spellStart"/>
-      <w:r>
-        <w:rPr>
-          <w:color w:val="000000"/>
-          <w:sz w:val="24"/>
-          <w:szCs w:val="24"/>
-        </w:rPr>
-        <w:t>anda</w:t>
-      </w:r>
-      <w:proofErr w:type="spellEnd"/>
-      <w:r>
-        <w:rPr>
-          <w:color w:val="000000"/>
-          <w:sz w:val="24"/>
-          <w:szCs w:val="24"/>
-        </w:rPr>
-        <w:t xml:space="preserve"> </w:t>
-      </w:r>
-      <w:proofErr w:type="spellStart"/>
-      <w:r>
-        <w:rPr>
-          <w:color w:val="000000"/>
-          <w:sz w:val="24"/>
-          <w:szCs w:val="24"/>
-        </w:rPr>
-        <w:t>wajib</w:t>
-      </w:r>
-      <w:proofErr w:type="spellEnd"/>
-      <w:r>
-        <w:rPr>
-          <w:color w:val="000000"/>
-          <w:sz w:val="24"/>
-          <w:szCs w:val="24"/>
-        </w:rPr>
-        <w:t xml:space="preserve"> </w:t>
-      </w:r>
-      <w:proofErr w:type="spellStart"/>
-      <w:r>
-        <w:rPr>
-          <w:color w:val="000000"/>
-          <w:sz w:val="24"/>
-          <w:szCs w:val="24"/>
-        </w:rPr>
-        <w:t>melampirkan</w:t>
-      </w:r>
-      <w:proofErr w:type="spellEnd"/>
-      <w:r>
-        <w:rPr>
-          <w:color w:val="000000"/>
-          <w:sz w:val="24"/>
-          <w:szCs w:val="24"/>
-        </w:rPr>
-        <w:t xml:space="preserve"> </w:t>
-      </w:r>
-      <w:proofErr w:type="spellStart"/>
-      <w:r>
-        <w:rPr>
-          <w:color w:val="000000"/>
-          <w:sz w:val="24"/>
-          <w:szCs w:val="24"/>
-        </w:rPr>
-        <w:t>dokumen</w:t>
-      </w:r>
-      <w:proofErr w:type="spellEnd"/>
-      <w:r>
-        <w:rPr>
-          <w:color w:val="000000"/>
-          <w:sz w:val="24"/>
-          <w:szCs w:val="24"/>
-        </w:rPr>
-        <w:t xml:space="preserve"> </w:t>
-      </w:r>
-      <w:proofErr w:type="spellStart"/>
-      <w:r>
-        <w:rPr>
-          <w:color w:val="000000"/>
-          <w:sz w:val="24"/>
-          <w:szCs w:val="24"/>
-        </w:rPr>
-        <w:t>laporan</w:t>
-      </w:r>
-      <w:proofErr w:type="spellEnd"/>
-      <w:r>
-        <w:rPr>
-          <w:color w:val="000000"/>
-          <w:sz w:val="24"/>
-          <w:szCs w:val="24"/>
-        </w:rPr>
-        <w:t xml:space="preserve"> </w:t>
-      </w:r>
-      <w:proofErr w:type="spellStart"/>
-      <w:r>
-        <w:rPr>
-          <w:color w:val="000000"/>
-          <w:sz w:val="24"/>
-          <w:szCs w:val="24"/>
-        </w:rPr>
-        <w:t>praktikum</w:t>
-      </w:r>
-      <w:proofErr w:type="spellEnd"/>
-      <w:r>
-        <w:rPr>
-          <w:color w:val="000000"/>
-          <w:sz w:val="24"/>
-          <w:szCs w:val="24"/>
-        </w:rPr>
-        <w:t xml:space="preserve"> </w:t>
-      </w:r>
-      <w:proofErr w:type="spellStart"/>
-      <w:r>
-        <w:rPr>
-          <w:color w:val="000000"/>
-          <w:sz w:val="24"/>
-          <w:szCs w:val="24"/>
-        </w:rPr>
-        <w:t>ini</w:t>
-      </w:r>
-      <w:proofErr w:type="spellEnd"/>
-      <w:r>
-        <w:rPr>
-          <w:color w:val="000000"/>
-          <w:sz w:val="24"/>
-          <w:szCs w:val="24"/>
-        </w:rPr>
-        <w:t>.</w:t>
+          <w:lang w:val="sv-SE"/>
+        </w:rPr>
+        <w:t>Jika tidak ada tugas, maka setiap praktikum anda wajib melampirkan dokumen laporan praktikum ini.</w:t>
       </w:r>
     </w:p>
     <w:p>
@@ -4934,6 +2515,7 @@
           <w:color w:val="808080"/>
           <w:spacing w:val="-35"/>
           <w:sz w:val="30"/>
+          <w:lang w:val="sv-SE"/>
         </w:rPr>
       </w:pPr>
     </w:p>
@@ -4949,15 +2531,12 @@
           <w:szCs w:val="22"/>
         </w:rPr>
       </w:pPr>
-      <w:proofErr w:type="spellStart"/>
       <w:r>
         <w:rPr>
           <w:sz w:val="30"/>
         </w:rPr>
-        <w:lastRenderedPageBreak/>
         <w:t>Referensi</w:t>
       </w:r>
-      <w:proofErr w:type="spellEnd"/>
       <w:r>
         <w:rPr>
           <w:spacing w:val="-100"/>
@@ -4981,6 +2560,7 @@
           <w:sz w:val="22"/>
           <w:szCs w:val="22"/>
         </w:rPr>
+        <w:lastRenderedPageBreak/>
         <w:t xml:space="preserve">A Forouzan, Behrouz. 2007. Data Communication and Networking Fourth Edition, McGraw-Hill Education, Singapore. </w:t>
       </w:r>
     </w:p>
@@ -5008,366 +2588,7 @@
           <w:lang w:val="nb-NO"/>
         </w:rPr>
         <w:br/>
-      </w:r>
-      <w:proofErr w:type="spellStart"/>
-      <w:r>
-        <w:rPr>
-          <w:sz w:val="22"/>
-          <w:szCs w:val="22"/>
-          <w:lang w:val="nb-NO"/>
-        </w:rPr>
-        <w:t>Lampirkan</w:t>
-      </w:r>
-      <w:proofErr w:type="spellEnd"/>
-      <w:r>
-        <w:rPr>
-          <w:sz w:val="22"/>
-          <w:szCs w:val="22"/>
-          <w:lang w:val="nb-NO"/>
-        </w:rPr>
-        <w:t xml:space="preserve"> </w:t>
-      </w:r>
-      <w:proofErr w:type="spellStart"/>
-      <w:r>
-        <w:rPr>
-          <w:sz w:val="22"/>
-          <w:szCs w:val="22"/>
-          <w:lang w:val="nb-NO"/>
-        </w:rPr>
-        <w:t>referensi</w:t>
-      </w:r>
-      <w:proofErr w:type="spellEnd"/>
-      <w:r>
-        <w:rPr>
-          <w:sz w:val="22"/>
-          <w:szCs w:val="22"/>
-          <w:lang w:val="nb-NO"/>
-        </w:rPr>
-        <w:t xml:space="preserve"> </w:t>
-      </w:r>
-      <w:proofErr w:type="spellStart"/>
-      <w:r>
-        <w:rPr>
-          <w:sz w:val="22"/>
-          <w:szCs w:val="22"/>
-          <w:lang w:val="nb-NO"/>
-        </w:rPr>
-        <w:t>yang</w:t>
-      </w:r>
-      <w:proofErr w:type="spellEnd"/>
-      <w:r>
-        <w:rPr>
-          <w:sz w:val="22"/>
-          <w:szCs w:val="22"/>
-          <w:lang w:val="nb-NO"/>
-        </w:rPr>
-        <w:t xml:space="preserve"> </w:t>
-      </w:r>
-      <w:proofErr w:type="spellStart"/>
-      <w:r>
-        <w:rPr>
-          <w:sz w:val="22"/>
-          <w:szCs w:val="22"/>
-          <w:lang w:val="nb-NO"/>
-        </w:rPr>
-        <w:t>digunakan</w:t>
-      </w:r>
-      <w:proofErr w:type="spellEnd"/>
-      <w:r>
-        <w:rPr>
-          <w:sz w:val="22"/>
-          <w:szCs w:val="22"/>
-          <w:lang w:val="nb-NO"/>
-        </w:rPr>
-        <w:t xml:space="preserve"> </w:t>
-      </w:r>
-      <w:proofErr w:type="spellStart"/>
-      <w:r>
-        <w:rPr>
-          <w:sz w:val="22"/>
-          <w:szCs w:val="22"/>
-          <w:lang w:val="nb-NO"/>
-        </w:rPr>
-        <w:t>pada</w:t>
-      </w:r>
-      <w:proofErr w:type="spellEnd"/>
-      <w:r>
-        <w:rPr>
-          <w:sz w:val="22"/>
-          <w:szCs w:val="22"/>
-          <w:lang w:val="nb-NO"/>
-        </w:rPr>
-        <w:t xml:space="preserve"> modul praktikum, </w:t>
-      </w:r>
-      <w:proofErr w:type="spellStart"/>
-      <w:r>
-        <w:rPr>
-          <w:sz w:val="22"/>
-          <w:szCs w:val="22"/>
-          <w:lang w:val="nb-NO"/>
-        </w:rPr>
-        <w:t>jika</w:t>
-      </w:r>
-      <w:proofErr w:type="spellEnd"/>
-      <w:r>
-        <w:rPr>
-          <w:sz w:val="22"/>
-          <w:szCs w:val="22"/>
-          <w:lang w:val="nb-NO"/>
-        </w:rPr>
-        <w:t xml:space="preserve"> </w:t>
-      </w:r>
-      <w:proofErr w:type="spellStart"/>
-      <w:r>
-        <w:rPr>
-          <w:sz w:val="22"/>
-          <w:szCs w:val="22"/>
-          <w:lang w:val="nb-NO"/>
-        </w:rPr>
-        <w:t>ada</w:t>
-      </w:r>
-      <w:proofErr w:type="spellEnd"/>
-      <w:r>
-        <w:rPr>
-          <w:sz w:val="22"/>
-          <w:szCs w:val="22"/>
-          <w:lang w:val="nb-NO"/>
-        </w:rPr>
-        <w:t xml:space="preserve"> </w:t>
-      </w:r>
-      <w:proofErr w:type="spellStart"/>
-      <w:r>
-        <w:rPr>
-          <w:sz w:val="22"/>
-          <w:szCs w:val="22"/>
-          <w:lang w:val="nb-NO"/>
-        </w:rPr>
-        <w:t>referensi</w:t>
-      </w:r>
-      <w:proofErr w:type="spellEnd"/>
-      <w:r>
-        <w:rPr>
-          <w:sz w:val="22"/>
-          <w:szCs w:val="22"/>
-          <w:lang w:val="nb-NO"/>
-        </w:rPr>
-        <w:t xml:space="preserve"> </w:t>
-      </w:r>
-      <w:proofErr w:type="spellStart"/>
-      <w:r>
-        <w:rPr>
-          <w:sz w:val="22"/>
-          <w:szCs w:val="22"/>
-          <w:lang w:val="nb-NO"/>
-        </w:rPr>
-        <w:t>tambahan</w:t>
-      </w:r>
-      <w:proofErr w:type="spellEnd"/>
-      <w:r>
-        <w:rPr>
-          <w:sz w:val="22"/>
-          <w:szCs w:val="22"/>
-          <w:lang w:val="nb-NO"/>
-        </w:rPr>
-        <w:t xml:space="preserve"> </w:t>
-      </w:r>
-      <w:proofErr w:type="spellStart"/>
-      <w:r>
-        <w:rPr>
-          <w:sz w:val="22"/>
-          <w:szCs w:val="22"/>
-          <w:lang w:val="nb-NO"/>
-        </w:rPr>
-        <w:t>lain</w:t>
-      </w:r>
-      <w:proofErr w:type="spellEnd"/>
-      <w:r>
-        <w:rPr>
-          <w:sz w:val="22"/>
-          <w:szCs w:val="22"/>
-          <w:lang w:val="nb-NO"/>
-        </w:rPr>
-        <w:t xml:space="preserve"> </w:t>
-      </w:r>
-      <w:proofErr w:type="spellStart"/>
-      <w:r>
-        <w:rPr>
-          <w:sz w:val="22"/>
-          <w:szCs w:val="22"/>
-          <w:lang w:val="nb-NO"/>
-        </w:rPr>
-        <w:t>yang</w:t>
-      </w:r>
-      <w:proofErr w:type="spellEnd"/>
-      <w:r>
-        <w:rPr>
-          <w:sz w:val="22"/>
-          <w:szCs w:val="22"/>
-          <w:lang w:val="nb-NO"/>
-        </w:rPr>
-        <w:t xml:space="preserve"> anda </w:t>
-      </w:r>
-      <w:proofErr w:type="spellStart"/>
-      <w:r>
-        <w:rPr>
-          <w:sz w:val="22"/>
-          <w:szCs w:val="22"/>
-          <w:lang w:val="nb-NO"/>
-        </w:rPr>
-        <w:t>gunakan</w:t>
-      </w:r>
-      <w:proofErr w:type="spellEnd"/>
-      <w:r>
-        <w:rPr>
-          <w:sz w:val="22"/>
-          <w:szCs w:val="22"/>
-          <w:lang w:val="nb-NO"/>
-        </w:rPr>
-        <w:t xml:space="preserve"> </w:t>
-      </w:r>
-      <w:proofErr w:type="spellStart"/>
-      <w:r>
-        <w:rPr>
-          <w:sz w:val="22"/>
-          <w:szCs w:val="22"/>
-          <w:lang w:val="nb-NO"/>
-        </w:rPr>
-        <w:t>dalam</w:t>
-      </w:r>
-      <w:proofErr w:type="spellEnd"/>
-      <w:r>
-        <w:rPr>
-          <w:sz w:val="22"/>
-          <w:szCs w:val="22"/>
-          <w:lang w:val="nb-NO"/>
-        </w:rPr>
-        <w:t xml:space="preserve"> </w:t>
-      </w:r>
-      <w:proofErr w:type="spellStart"/>
-      <w:r>
-        <w:rPr>
-          <w:sz w:val="22"/>
-          <w:szCs w:val="22"/>
-          <w:lang w:val="nb-NO"/>
-        </w:rPr>
-        <w:t>menjawab</w:t>
-      </w:r>
-      <w:proofErr w:type="spellEnd"/>
-      <w:r>
-        <w:rPr>
-          <w:sz w:val="22"/>
-          <w:szCs w:val="22"/>
-          <w:lang w:val="nb-NO"/>
-        </w:rPr>
-        <w:t xml:space="preserve"> </w:t>
-      </w:r>
-      <w:proofErr w:type="spellStart"/>
-      <w:r>
-        <w:rPr>
-          <w:sz w:val="22"/>
-          <w:szCs w:val="22"/>
-          <w:lang w:val="nb-NO"/>
-        </w:rPr>
-        <w:t>tugas</w:t>
-      </w:r>
-      <w:proofErr w:type="spellEnd"/>
-      <w:r>
-        <w:rPr>
-          <w:sz w:val="22"/>
-          <w:szCs w:val="22"/>
-          <w:lang w:val="nb-NO"/>
-        </w:rPr>
-        <w:t xml:space="preserve">, </w:t>
-      </w:r>
-      <w:proofErr w:type="spellStart"/>
-      <w:r>
-        <w:rPr>
-          <w:sz w:val="22"/>
-          <w:szCs w:val="22"/>
-          <w:lang w:val="nb-NO"/>
-        </w:rPr>
-        <w:t>silahkan</w:t>
-      </w:r>
-      <w:proofErr w:type="spellEnd"/>
-      <w:r>
-        <w:rPr>
-          <w:sz w:val="22"/>
-          <w:szCs w:val="22"/>
-          <w:lang w:val="nb-NO"/>
-        </w:rPr>
-        <w:t xml:space="preserve"> </w:t>
-      </w:r>
-      <w:proofErr w:type="spellStart"/>
-      <w:r>
-        <w:rPr>
-          <w:sz w:val="22"/>
-          <w:szCs w:val="22"/>
-          <w:lang w:val="nb-NO"/>
-        </w:rPr>
-        <w:t>dilampirkan</w:t>
-      </w:r>
-      <w:proofErr w:type="spellEnd"/>
-      <w:r>
-        <w:rPr>
-          <w:sz w:val="22"/>
-          <w:szCs w:val="22"/>
-          <w:lang w:val="nb-NO"/>
-        </w:rPr>
-        <w:t xml:space="preserve"> juga </w:t>
-      </w:r>
-      <w:proofErr w:type="spellStart"/>
-      <w:r>
-        <w:rPr>
-          <w:sz w:val="22"/>
-          <w:szCs w:val="22"/>
-          <w:lang w:val="nb-NO"/>
-        </w:rPr>
-        <w:t>dengan</w:t>
-      </w:r>
-      <w:proofErr w:type="spellEnd"/>
-      <w:r>
-        <w:rPr>
-          <w:sz w:val="22"/>
-          <w:szCs w:val="22"/>
-          <w:lang w:val="nb-NO"/>
-        </w:rPr>
-        <w:t xml:space="preserve"> format </w:t>
-      </w:r>
-      <w:proofErr w:type="spellStart"/>
-      <w:r>
-        <w:rPr>
-          <w:sz w:val="22"/>
-          <w:szCs w:val="22"/>
-          <w:lang w:val="nb-NO"/>
-        </w:rPr>
-        <w:t>seperti</w:t>
-      </w:r>
-      <w:proofErr w:type="spellEnd"/>
-      <w:r>
-        <w:rPr>
-          <w:sz w:val="22"/>
-          <w:szCs w:val="22"/>
-          <w:lang w:val="nb-NO"/>
-        </w:rPr>
-        <w:t xml:space="preserve"> di </w:t>
-      </w:r>
-      <w:proofErr w:type="spellStart"/>
-      <w:r>
-        <w:rPr>
-          <w:sz w:val="22"/>
-          <w:szCs w:val="22"/>
-          <w:lang w:val="nb-NO"/>
-        </w:rPr>
-        <w:t>atas</w:t>
-      </w:r>
-      <w:proofErr w:type="spellEnd"/>
-      <w:r>
-        <w:rPr>
-          <w:sz w:val="22"/>
-          <w:szCs w:val="22"/>
-          <w:lang w:val="nb-NO"/>
-        </w:rPr>
-        <w:t>.</w:t>
+        <w:t>Lampirkan referensi yang digunakan pada modul praktikum, jika ada referensi tambahan lain yang anda gunakan dalam menjawab tugas, silahkan dilampirkan juga dengan format seperti di atas.</w:t>
       </w:r>
     </w:p>
     <w:sectPr>
@@ -5528,7 +2749,7 @@
                       </a:ln>
                       <a:extLst>
                         <a:ext uri="{909E8E84-426E-40dd-AFC4-6F175D3DCCD1}">
-                          <a14:hiddenFill xmlns:a14="http://schemas.microsoft.com/office/drawing/2010/main" xmlns:w="http://schemas.openxmlformats.org/wordprocessingml/2006/main" xmlns:w10="urn:schemas-microsoft-com:office:word" xmlns:v="urn:schemas-microsoft-com:vml" xmlns:o="urn:schemas-microsoft-com:office:office" xmlns="" xmlns:mv="urn:schemas-microsoft-com:mac:vml" xmlns:mo="http://schemas.microsoft.com/office/mac/office/2008/main">
+                          <a14:hiddenFill xmlns:mo="http://schemas.microsoft.com/office/mac/office/2008/main" xmlns:mv="urn:schemas-microsoft-com:mac:vml" xmlns="" xmlns:o="urn:schemas-microsoft-com:office:office" xmlns:v="urn:schemas-microsoft-com:vml" xmlns:w10="urn:schemas-microsoft-com:office:word" xmlns:w="http://schemas.openxmlformats.org/wordprocessingml/2006/main" xmlns:a14="http://schemas.microsoft.com/office/drawing/2010/main">
                             <a:noFill/>
                           </a14:hiddenFill>
                         </a:ext>
@@ -5588,27 +2809,7 @@
         <w:spacing w:val="0"/>
         <w:sz w:val="16"/>
       </w:rPr>
-      <w:t xml:space="preserve">Teknik </w:t>
-    </w:r>
-    <w:proofErr w:type="spellStart"/>
-    <w:r>
-      <w:rPr>
-        <w:rFonts w:cs="Arial"/>
-        <w:caps w:val="0"/>
-        <w:spacing w:val="0"/>
-        <w:sz w:val="16"/>
-      </w:rPr>
-      <w:t>Informatika</w:t>
-    </w:r>
-    <w:proofErr w:type="spellEnd"/>
-    <w:r>
-      <w:rPr>
-        <w:rFonts w:cs="Arial"/>
-        <w:caps w:val="0"/>
-        <w:spacing w:val="0"/>
-        <w:sz w:val="16"/>
-      </w:rPr>
-      <w:t xml:space="preserve"> ITERA</w:t>
+      <w:t>Teknik Informatika ITERA</w:t>
     </w:r>
   </w:p>
 </w:hdr>
@@ -5647,14 +2848,14 @@
         <v:path o:extrusionok="f" gradientshapeok="t" o:connecttype="rect"/>
         <o:lock v:ext="edit" aspectratio="t"/>
       </v:shapetype>
-      <v:shape id="_x0000_i1083" type="#_x0000_t75" style="width:10.9pt;height:10.9pt" o:bullet="t">
+      <v:shape id="_x0000_i1025" type="#_x0000_t75" style="width:10.9pt;height:10.9pt" o:bullet="t">
         <v:imagedata r:id="rId1" o:title="mso35"/>
       </v:shape>
     </w:pict>
   </w:numPicBullet>
   <w:numPicBullet w:numPicBulletId="1">
     <w:pict>
-      <v:shape id="_x0000_i1084" type="#_x0000_t75" style="width:10.9pt;height:10.9pt" o:bullet="t">
+      <v:shape id="_x0000_i1026" type="#_x0000_t75" style="width:10.9pt;height:10.9pt" o:bullet="t">
         <v:imagedata r:id="rId2" o:title="BD21421_"/>
       </v:shape>
     </w:pict>
@@ -11452,7 +8653,6 @@
   <w:style w:type="character" w:default="1" w:styleId="DefaultParagraphFont">
     <w:name w:val="Default Paragraph Font"/>
     <w:uiPriority w:val="1"/>
-    <w:semiHidden/>
     <w:unhideWhenUsed/>
   </w:style>
   <w:style w:type="table" w:default="1" w:styleId="TableNormal">

</xml_diff>